<commit_message>
Actualització de Grups, Puntuacio i KarmaAlumne per a actualitzar Karma Grup
</commit_message>
<xml_diff>
--- a/docs/Guia_d_Usuari_KarmaWEBAPI.docx
+++ b/docs/Guia_d_Usuari_KarmaWEBAPI.docx
@@ -4,169 +4,186 @@
   <w:body>
     <w:sdt>
       <w:sdtPr>
-        <w:rPr>
-          <w:lang w:val="ca-ES"/>
-        </w:rPr>
-        <w:id w:val="1106234143"/>
+        <w:id w:val="2051348198"/>
         <w:docPartObj>
           <w:docPartGallery w:val="Cover Pages"/>
           <w:docPartUnique/>
         </w:docPartObj>
       </w:sdtPr>
+      <w:sdtEndPr>
+        <w:rPr>
+          <w:b/>
+          <w:bCs/>
+        </w:rPr>
+      </w:sdtEndPr>
       <w:sdtContent>
         <w:p>
-          <w:pPr>
-            <w:rPr>
-              <w:lang w:val="ca-ES"/>
-            </w:rPr>
-          </w:pPr>
-        </w:p>
-        <w:p>
-          <w:pPr>
-            <w:rPr>
-              <w:rFonts w:asciiTheme="majorHAnsi" w:eastAsiaTheme="majorEastAsia" w:hAnsiTheme="majorHAnsi" w:cstheme="majorBidi"/>
-              <w:color w:val="17365D" w:themeColor="text2" w:themeShade="BF"/>
-              <w:spacing w:val="5"/>
-              <w:kern w:val="28"/>
-              <w:sz w:val="52"/>
-              <w:szCs w:val="52"/>
-              <w:lang w:val="ca-ES"/>
-            </w:rPr>
-          </w:pPr>
           <w:r>
             <w:rPr>
               <w:noProof/>
-              <w:lang w:val="ca-ES"/>
             </w:rPr>
             <mc:AlternateContent>
               <mc:Choice Requires="wpg">
                 <w:drawing>
-                  <wp:anchor distT="0" distB="0" distL="114300" distR="114300" simplePos="0" relativeHeight="251654144" behindDoc="1" locked="0" layoutInCell="1" allowOverlap="1" wp14:anchorId="31EB0B20" wp14:editId="2116A9B6">
+                  <wp:anchor distT="0" distB="0" distL="114300" distR="114300" simplePos="0" relativeHeight="251662336" behindDoc="0" locked="0" layoutInCell="1" allowOverlap="1" wp14:anchorId="6242925C" wp14:editId="2EF5C5FD">
                     <wp:simplePos x="0" y="0"/>
-                    <wp:positionH relativeFrom="margin">
+                    <wp:positionH relativeFrom="page">
                       <wp:align>center</wp:align>
                     </wp:positionH>
                     <mc:AlternateContent>
                       <mc:Choice Requires="wp14">
                         <wp:positionV relativeFrom="page">
-                          <wp14:pctPosVOffset>4500</wp14:pctPosVOffset>
+                          <wp14:pctPosVOffset>2300</wp14:pctPosVOffset>
                         </wp:positionV>
                       </mc:Choice>
                       <mc:Fallback>
                         <wp:positionV relativeFrom="page">
-                          <wp:posOffset>452120</wp:posOffset>
+                          <wp:posOffset>231140</wp:posOffset>
                         </wp:positionV>
                       </mc:Fallback>
                     </mc:AlternateContent>
-                    <wp:extent cx="6858000" cy="7068185"/>
-                    <wp:effectExtent l="0" t="0" r="0" b="0"/>
+                    <wp:extent cx="7315200" cy="1215391"/>
+                    <wp:effectExtent l="0" t="0" r="1270" b="1905"/>
                     <wp:wrapNone/>
-                    <wp:docPr id="125" name="Grupo 125"/>
-                    <wp:cNvGraphicFramePr>
-                      <a:graphicFrameLocks xmlns:a="http://schemas.openxmlformats.org/drawingml/2006/main" noChangeAspect="1"/>
-                    </wp:cNvGraphicFramePr>
+                    <wp:docPr id="149" name="Grupo 149"/>
+                    <wp:cNvGraphicFramePr/>
                     <a:graphic xmlns:a="http://schemas.openxmlformats.org/drawingml/2006/main">
                       <a:graphicData uri="http://schemas.microsoft.com/office/word/2010/wordprocessingGroup">
                         <wpg:wgp>
-                          <wpg:cNvGrpSpPr>
-                            <a:grpSpLocks noChangeAspect="1"/>
-                          </wpg:cNvGrpSpPr>
+                          <wpg:cNvGrpSpPr/>
                           <wpg:grpSpPr>
                             <a:xfrm>
                               <a:off x="0" y="0"/>
-                              <a:ext cx="6858000" cy="7068312"/>
-                              <a:chOff x="0" y="0"/>
-                              <a:chExt cx="5561330" cy="5404485"/>
+                              <a:ext cx="7315200" cy="1215391"/>
+                              <a:chOff x="0" y="-1"/>
+                              <a:chExt cx="7315200" cy="1216153"/>
                             </a:xfrm>
                           </wpg:grpSpPr>
                           <wps:wsp>
-                            <wps:cNvPr id="126" name="Forma libre 10"/>
-                            <wps:cNvSpPr>
-                              <a:spLocks/>
-                            </wps:cNvSpPr>
-                            <wps:spPr bwMode="auto">
+                            <wps:cNvPr id="150" name="Rectángulo 51"/>
+                            <wps:cNvSpPr/>
+                            <wps:spPr>
                               <a:xfrm>
-                                <a:off x="0" y="0"/>
-                                <a:ext cx="5557520" cy="5404485"/>
+                                <a:off x="0" y="-1"/>
+                                <a:ext cx="7315200" cy="1130373"/>
                               </a:xfrm>
                               <a:custGeom>
                                 <a:avLst/>
                                 <a:gdLst>
-                                  <a:gd name="T0" fmla="*/ 0 w 720"/>
-                                  <a:gd name="T1" fmla="*/ 0 h 700"/>
-                                  <a:gd name="T2" fmla="*/ 0 w 720"/>
-                                  <a:gd name="T3" fmla="*/ 644 h 700"/>
-                                  <a:gd name="T4" fmla="*/ 113 w 720"/>
-                                  <a:gd name="T5" fmla="*/ 665 h 700"/>
-                                  <a:gd name="T6" fmla="*/ 720 w 720"/>
-                                  <a:gd name="T7" fmla="*/ 644 h 700"/>
-                                  <a:gd name="T8" fmla="*/ 720 w 720"/>
-                                  <a:gd name="T9" fmla="*/ 617 h 700"/>
-                                  <a:gd name="T10" fmla="*/ 720 w 720"/>
-                                  <a:gd name="T11" fmla="*/ 0 h 700"/>
-                                  <a:gd name="T12" fmla="*/ 0 w 720"/>
-                                  <a:gd name="T13" fmla="*/ 0 h 700"/>
+                                  <a:gd name="connsiteX0" fmla="*/ 0 w 7312660"/>
+                                  <a:gd name="connsiteY0" fmla="*/ 0 h 1215390"/>
+                                  <a:gd name="connsiteX1" fmla="*/ 7312660 w 7312660"/>
+                                  <a:gd name="connsiteY1" fmla="*/ 0 h 1215390"/>
+                                  <a:gd name="connsiteX2" fmla="*/ 7312660 w 7312660"/>
+                                  <a:gd name="connsiteY2" fmla="*/ 1215390 h 1215390"/>
+                                  <a:gd name="connsiteX3" fmla="*/ 0 w 7312660"/>
+                                  <a:gd name="connsiteY3" fmla="*/ 1215390 h 1215390"/>
+                                  <a:gd name="connsiteX4" fmla="*/ 0 w 7312660"/>
+                                  <a:gd name="connsiteY4" fmla="*/ 0 h 1215390"/>
+                                  <a:gd name="connsiteX0" fmla="*/ 0 w 7312660"/>
+                                  <a:gd name="connsiteY0" fmla="*/ 0 h 1215390"/>
+                                  <a:gd name="connsiteX1" fmla="*/ 7312660 w 7312660"/>
+                                  <a:gd name="connsiteY1" fmla="*/ 0 h 1215390"/>
+                                  <a:gd name="connsiteX2" fmla="*/ 7312660 w 7312660"/>
+                                  <a:gd name="connsiteY2" fmla="*/ 1215390 h 1215390"/>
+                                  <a:gd name="connsiteX3" fmla="*/ 3667125 w 7312660"/>
+                                  <a:gd name="connsiteY3" fmla="*/ 1209675 h 1215390"/>
+                                  <a:gd name="connsiteX4" fmla="*/ 0 w 7312660"/>
+                                  <a:gd name="connsiteY4" fmla="*/ 1215390 h 1215390"/>
+                                  <a:gd name="connsiteX5" fmla="*/ 0 w 7312660"/>
+                                  <a:gd name="connsiteY5" fmla="*/ 0 h 1215390"/>
+                                  <a:gd name="connsiteX0" fmla="*/ 0 w 7312660"/>
+                                  <a:gd name="connsiteY0" fmla="*/ 0 h 1215390"/>
+                                  <a:gd name="connsiteX1" fmla="*/ 7312660 w 7312660"/>
+                                  <a:gd name="connsiteY1" fmla="*/ 0 h 1215390"/>
+                                  <a:gd name="connsiteX2" fmla="*/ 7312660 w 7312660"/>
+                                  <a:gd name="connsiteY2" fmla="*/ 1215390 h 1215390"/>
+                                  <a:gd name="connsiteX3" fmla="*/ 3619500 w 7312660"/>
+                                  <a:gd name="connsiteY3" fmla="*/ 733425 h 1215390"/>
+                                  <a:gd name="connsiteX4" fmla="*/ 0 w 7312660"/>
+                                  <a:gd name="connsiteY4" fmla="*/ 1215390 h 1215390"/>
+                                  <a:gd name="connsiteX5" fmla="*/ 0 w 7312660"/>
+                                  <a:gd name="connsiteY5" fmla="*/ 0 h 1215390"/>
+                                  <a:gd name="connsiteX0" fmla="*/ 0 w 7312660"/>
+                                  <a:gd name="connsiteY0" fmla="*/ 0 h 1215390"/>
+                                  <a:gd name="connsiteX1" fmla="*/ 7312660 w 7312660"/>
+                                  <a:gd name="connsiteY1" fmla="*/ 0 h 1215390"/>
+                                  <a:gd name="connsiteX2" fmla="*/ 7312660 w 7312660"/>
+                                  <a:gd name="connsiteY2" fmla="*/ 1129665 h 1215390"/>
+                                  <a:gd name="connsiteX3" fmla="*/ 3619500 w 7312660"/>
+                                  <a:gd name="connsiteY3" fmla="*/ 733425 h 1215390"/>
+                                  <a:gd name="connsiteX4" fmla="*/ 0 w 7312660"/>
+                                  <a:gd name="connsiteY4" fmla="*/ 1215390 h 1215390"/>
+                                  <a:gd name="connsiteX5" fmla="*/ 0 w 7312660"/>
+                                  <a:gd name="connsiteY5" fmla="*/ 0 h 1215390"/>
+                                  <a:gd name="connsiteX0" fmla="*/ 9525 w 7322185"/>
+                                  <a:gd name="connsiteY0" fmla="*/ 0 h 1129665"/>
+                                  <a:gd name="connsiteX1" fmla="*/ 7322185 w 7322185"/>
+                                  <a:gd name="connsiteY1" fmla="*/ 0 h 1129665"/>
+                                  <a:gd name="connsiteX2" fmla="*/ 7322185 w 7322185"/>
+                                  <a:gd name="connsiteY2" fmla="*/ 1129665 h 1129665"/>
+                                  <a:gd name="connsiteX3" fmla="*/ 3629025 w 7322185"/>
+                                  <a:gd name="connsiteY3" fmla="*/ 733425 h 1129665"/>
+                                  <a:gd name="connsiteX4" fmla="*/ 0 w 7322185"/>
+                                  <a:gd name="connsiteY4" fmla="*/ 1091565 h 1129665"/>
+                                  <a:gd name="connsiteX5" fmla="*/ 9525 w 7322185"/>
+                                  <a:gd name="connsiteY5" fmla="*/ 0 h 1129665"/>
+                                  <a:gd name="connsiteX0" fmla="*/ 0 w 7312660"/>
+                                  <a:gd name="connsiteY0" fmla="*/ 0 h 1129665"/>
+                                  <a:gd name="connsiteX1" fmla="*/ 7312660 w 7312660"/>
+                                  <a:gd name="connsiteY1" fmla="*/ 0 h 1129665"/>
+                                  <a:gd name="connsiteX2" fmla="*/ 7312660 w 7312660"/>
+                                  <a:gd name="connsiteY2" fmla="*/ 1129665 h 1129665"/>
+                                  <a:gd name="connsiteX3" fmla="*/ 3619500 w 7312660"/>
+                                  <a:gd name="connsiteY3" fmla="*/ 733425 h 1129665"/>
+                                  <a:gd name="connsiteX4" fmla="*/ 0 w 7312660"/>
+                                  <a:gd name="connsiteY4" fmla="*/ 1091565 h 1129665"/>
+                                  <a:gd name="connsiteX5" fmla="*/ 0 w 7312660"/>
+                                  <a:gd name="connsiteY5" fmla="*/ 0 h 1129665"/>
                                 </a:gdLst>
                                 <a:ahLst/>
                                 <a:cxnLst>
                                   <a:cxn ang="0">
-                                    <a:pos x="T0" y="T1"/>
+                                    <a:pos x="connsiteX0" y="connsiteY0"/>
                                   </a:cxn>
                                   <a:cxn ang="0">
-                                    <a:pos x="T2" y="T3"/>
+                                    <a:pos x="connsiteX1" y="connsiteY1"/>
                                   </a:cxn>
                                   <a:cxn ang="0">
-                                    <a:pos x="T4" y="T5"/>
+                                    <a:pos x="connsiteX2" y="connsiteY2"/>
                                   </a:cxn>
                                   <a:cxn ang="0">
-                                    <a:pos x="T6" y="T7"/>
+                                    <a:pos x="connsiteX3" y="connsiteY3"/>
                                   </a:cxn>
                                   <a:cxn ang="0">
-                                    <a:pos x="T8" y="T9"/>
+                                    <a:pos x="connsiteX4" y="connsiteY4"/>
                                   </a:cxn>
                                   <a:cxn ang="0">
-                                    <a:pos x="T10" y="T11"/>
-                                  </a:cxn>
-                                  <a:cxn ang="0">
-                                    <a:pos x="T12" y="T13"/>
+                                    <a:pos x="connsiteX5" y="connsiteY5"/>
                                   </a:cxn>
                                 </a:cxnLst>
-                                <a:rect l="0" t="0" r="r" b="b"/>
+                                <a:rect l="l" t="t" r="r" b="b"/>
                                 <a:pathLst>
-                                  <a:path w="720" h="700">
+                                  <a:path w="7312660" h="1129665">
                                     <a:moveTo>
                                       <a:pt x="0" y="0"/>
                                     </a:moveTo>
-                                    <a:cubicBezTo>
-                                      <a:pt x="0" y="644"/>
-                                      <a:pt x="0" y="644"/>
-                                      <a:pt x="0" y="644"/>
-                                    </a:cubicBezTo>
-                                    <a:cubicBezTo>
-                                      <a:pt x="23" y="650"/>
-                                      <a:pt x="62" y="658"/>
-                                      <a:pt x="113" y="665"/>
-                                    </a:cubicBezTo>
-                                    <a:cubicBezTo>
-                                      <a:pt x="250" y="685"/>
-                                      <a:pt x="476" y="700"/>
-                                      <a:pt x="720" y="644"/>
-                                    </a:cubicBezTo>
-                                    <a:cubicBezTo>
-                                      <a:pt x="720" y="617"/>
-                                      <a:pt x="720" y="617"/>
-                                      <a:pt x="720" y="617"/>
-                                    </a:cubicBezTo>
-                                    <a:cubicBezTo>
-                                      <a:pt x="720" y="0"/>
-                                      <a:pt x="720" y="0"/>
-                                      <a:pt x="720" y="0"/>
-                                    </a:cubicBezTo>
-                                    <a:cubicBezTo>
+                                    <a:lnTo>
+                                      <a:pt x="7312660" y="0"/>
+                                    </a:lnTo>
+                                    <a:lnTo>
+                                      <a:pt x="7312660" y="1129665"/>
+                                    </a:lnTo>
+                                    <a:lnTo>
+                                      <a:pt x="3619500" y="733425"/>
+                                    </a:lnTo>
+                                    <a:lnTo>
+                                      <a:pt x="0" y="1091565"/>
+                                    </a:lnTo>
+                                    <a:lnTo>
                                       <a:pt x="0" y="0"/>
-                                      <a:pt x="0" y="0"/>
-                                      <a:pt x="0" y="0"/>
-                                    </a:cubicBezTo>
+                                    </a:lnTo>
+                                    <a:close/>
                                   </a:path>
                                 </a:pathLst>
                               </a:custGeom>
@@ -175,228 +192,94 @@
                               </a:ln>
                             </wps:spPr>
                             <wps:style>
-                              <a:lnRef idx="0">
-                                <a:scrgbClr r="0" g="0" b="0"/>
+                              <a:lnRef idx="2">
+                                <a:schemeClr val="accent1">
+                                  <a:shade val="50000"/>
+                                </a:schemeClr>
                               </a:lnRef>
-                              <a:fillRef idx="1003">
-                                <a:schemeClr val="dk2"/>
+                              <a:fillRef idx="1">
+                                <a:schemeClr val="accent1"/>
                               </a:fillRef>
                               <a:effectRef idx="0">
-                                <a:scrgbClr r="0" g="0" b="0"/>
+                                <a:schemeClr val="accent1"/>
                               </a:effectRef>
-                              <a:fontRef idx="major"/>
+                              <a:fontRef idx="minor">
+                                <a:schemeClr val="lt1"/>
+                              </a:fontRef>
                             </wps:style>
-                            <wps:txbx>
-                              <w:txbxContent>
-                                <w:p>
-                                  <w:pPr>
-                                    <w:rPr>
-                                      <w:color w:val="FFFFFF" w:themeColor="background1"/>
-                                      <w:sz w:val="72"/>
-                                      <w:szCs w:val="72"/>
-                                    </w:rPr>
-                                  </w:pPr>
-                                  <w:sdt>
-                                    <w:sdtPr>
-                                      <w:rPr>
-                                        <w:color w:val="FFFFFF" w:themeColor="background1"/>
-                                        <w:sz w:val="72"/>
-                                        <w:szCs w:val="72"/>
-                                      </w:rPr>
-                                      <w:alias w:val="Título"/>
-                                      <w:tag w:val=""/>
-                                      <w:id w:val="-554696155"/>
-                                      <w:dataBinding w:prefixMappings="xmlns:ns0='http://purl.org/dc/elements/1.1/' xmlns:ns1='http://schemas.openxmlformats.org/package/2006/metadata/core-properties' " w:xpath="/ns1:coreProperties[1]/ns0:title[1]" w:storeItemID="{6C3C8BC8-F283-45AE-878A-BAB7291924A1}"/>
-                                      <w:text/>
-                                    </w:sdtPr>
-                                    <w:sdtContent>
-                                      <w:r>
-                                        <w:rPr>
-                                          <w:color w:val="FFFFFF" w:themeColor="background1"/>
-                                          <w:sz w:val="72"/>
-                                          <w:szCs w:val="72"/>
-                                        </w:rPr>
-                                        <w:t>Guia d’ús KarmaWEBAPI</w:t>
-                                      </w:r>
-                                    </w:sdtContent>
-                                  </w:sdt>
-                                </w:p>
-                              </w:txbxContent>
-                            </wps:txbx>
-                            <wps:bodyPr rot="0" vert="horz" wrap="square" lIns="914400" tIns="1097280" rIns="1097280" bIns="1097280" anchor="b" anchorCtr="0" upright="1">
+                            <wps:bodyPr rot="0" spcFirstLastPara="0" vertOverflow="overflow" horzOverflow="overflow" vert="horz" wrap="square" lIns="91440" tIns="45720" rIns="91440" bIns="45720" numCol="1" spcCol="0" rtlCol="0" fromWordArt="0" anchor="ctr" anchorCtr="0" forceAA="0" compatLnSpc="1">
+                              <a:prstTxWarp prst="textNoShape">
+                                <a:avLst/>
+                              </a:prstTxWarp>
                               <a:noAutofit/>
                             </wps:bodyPr>
                           </wps:wsp>
                           <wps:wsp>
-                            <wps:cNvPr id="127" name="Forma libre 11"/>
-                            <wps:cNvSpPr>
-                              <a:spLocks/>
-                            </wps:cNvSpPr>
-                            <wps:spPr bwMode="auto">
+                            <wps:cNvPr id="151" name="Rectángulo 151"/>
+                            <wps:cNvSpPr/>
+                            <wps:spPr>
                               <a:xfrm>
-                                <a:off x="876300" y="4769783"/>
-                                <a:ext cx="4685030" cy="509905"/>
+                                <a:off x="0" y="0"/>
+                                <a:ext cx="7315200" cy="1216152"/>
                               </a:xfrm>
-                              <a:custGeom>
+                              <a:prstGeom prst="rect">
                                 <a:avLst/>
-                                <a:gdLst>
-                                  <a:gd name="T0" fmla="*/ 607 w 607"/>
-                                  <a:gd name="T1" fmla="*/ 0 h 66"/>
-                                  <a:gd name="T2" fmla="*/ 176 w 607"/>
-                                  <a:gd name="T3" fmla="*/ 57 h 66"/>
-                                  <a:gd name="T4" fmla="*/ 0 w 607"/>
-                                  <a:gd name="T5" fmla="*/ 48 h 66"/>
-                                  <a:gd name="T6" fmla="*/ 251 w 607"/>
-                                  <a:gd name="T7" fmla="*/ 66 h 66"/>
-                                  <a:gd name="T8" fmla="*/ 607 w 607"/>
-                                  <a:gd name="T9" fmla="*/ 27 h 66"/>
-                                  <a:gd name="T10" fmla="*/ 607 w 607"/>
-                                  <a:gd name="T11" fmla="*/ 0 h 66"/>
-                                </a:gdLst>
-                                <a:ahLst/>
-                                <a:cxnLst>
-                                  <a:cxn ang="0">
-                                    <a:pos x="T0" y="T1"/>
-                                  </a:cxn>
-                                  <a:cxn ang="0">
-                                    <a:pos x="T2" y="T3"/>
-                                  </a:cxn>
-                                  <a:cxn ang="0">
-                                    <a:pos x="T4" y="T5"/>
-                                  </a:cxn>
-                                  <a:cxn ang="0">
-                                    <a:pos x="T6" y="T7"/>
-                                  </a:cxn>
-                                  <a:cxn ang="0">
-                                    <a:pos x="T8" y="T9"/>
-                                  </a:cxn>
-                                  <a:cxn ang="0">
-                                    <a:pos x="T10" y="T11"/>
-                                  </a:cxn>
-                                </a:cxnLst>
-                                <a:rect l="0" t="0" r="r" b="b"/>
-                                <a:pathLst>
-                                  <a:path w="607" h="66">
-                                    <a:moveTo>
-                                      <a:pt x="607" y="0"/>
-                                    </a:moveTo>
-                                    <a:cubicBezTo>
-                                      <a:pt x="450" y="44"/>
-                                      <a:pt x="300" y="57"/>
-                                      <a:pt x="176" y="57"/>
-                                    </a:cubicBezTo>
-                                    <a:cubicBezTo>
-                                      <a:pt x="109" y="57"/>
-                                      <a:pt x="49" y="53"/>
-                                      <a:pt x="0" y="48"/>
-                                    </a:cubicBezTo>
-                                    <a:cubicBezTo>
-                                      <a:pt x="66" y="58"/>
-                                      <a:pt x="152" y="66"/>
-                                      <a:pt x="251" y="66"/>
-                                    </a:cubicBezTo>
-                                    <a:cubicBezTo>
-                                      <a:pt x="358" y="66"/>
-                                      <a:pt x="480" y="56"/>
-                                      <a:pt x="607" y="27"/>
-                                    </a:cubicBezTo>
-                                    <a:cubicBezTo>
-                                      <a:pt x="607" y="0"/>
-                                      <a:pt x="607" y="0"/>
-                                      <a:pt x="607" y="0"/>
-                                    </a:cubicBezTo>
-                                  </a:path>
-                                </a:pathLst>
-                              </a:custGeom>
-                              <a:solidFill>
-                                <a:schemeClr val="bg1">
-                                  <a:alpha val="30000"/>
-                                </a:schemeClr>
-                              </a:solidFill>
+                              </a:prstGeom>
+                              <a:blipFill>
+                                <a:blip r:embed="rId9"/>
+                                <a:stretch>
+                                  <a:fillRect r="-7574"/>
+                                </a:stretch>
+                              </a:blipFill>
                               <a:ln>
                                 <a:noFill/>
                               </a:ln>
-                              <a:extLst>
-                                <a:ext uri="{91240B29-F687-4F45-9708-019B960494DF}">
-                                  <a14:hiddenLine xmlns:a14="http://schemas.microsoft.com/office/drawing/2010/main" w="9525">
-                                    <a:solidFill>
-                                      <a:srgbClr val="000000"/>
-                                    </a:solidFill>
-                                    <a:round/>
-                                    <a:headEnd/>
-                                    <a:tailEnd/>
-                                  </a14:hiddenLine>
-                                </a:ext>
-                              </a:extLst>
                             </wps:spPr>
-                            <wps:bodyPr rot="0" vert="horz" wrap="square" lIns="91440" tIns="45720" rIns="91440" bIns="45720" anchor="b" anchorCtr="0" upright="1">
+                            <wps:style>
+                              <a:lnRef idx="2">
+                                <a:schemeClr val="accent1">
+                                  <a:shade val="50000"/>
+                                </a:schemeClr>
+                              </a:lnRef>
+                              <a:fillRef idx="1">
+                                <a:schemeClr val="accent1"/>
+                              </a:fillRef>
+                              <a:effectRef idx="0">
+                                <a:schemeClr val="accent1"/>
+                              </a:effectRef>
+                              <a:fontRef idx="minor">
+                                <a:schemeClr val="lt1"/>
+                              </a:fontRef>
+                            </wps:style>
+                            <wps:bodyPr rot="0" spcFirstLastPara="0" vertOverflow="overflow" horzOverflow="overflow" vert="horz" wrap="square" lIns="91440" tIns="45720" rIns="91440" bIns="45720" numCol="1" spcCol="0" rtlCol="0" fromWordArt="0" anchor="ctr" anchorCtr="0" forceAA="0" compatLnSpc="1">
+                              <a:prstTxWarp prst="textNoShape">
+                                <a:avLst/>
+                              </a:prstTxWarp>
                               <a:noAutofit/>
                             </wps:bodyPr>
                           </wps:wsp>
                         </wpg:wgp>
                       </a:graphicData>
                     </a:graphic>
-                    <wp14:sizeRelH relativeFrom="margin">
-                      <wp14:pctWidth>115400</wp14:pctWidth>
+                    <wp14:sizeRelH relativeFrom="page">
+                      <wp14:pctWidth>94100</wp14:pctWidth>
                     </wp14:sizeRelH>
                     <wp14:sizeRelV relativeFrom="page">
-                      <wp14:pctHeight>67000</wp14:pctHeight>
+                      <wp14:pctHeight>12100</wp14:pctHeight>
                     </wp14:sizeRelV>
                   </wp:anchor>
                 </w:drawing>
               </mc:Choice>
               <mc:Fallback>
                 <w:pict>
-                  <v:group w14:anchorId="31EB0B20" id="Grupo 125" o:spid="_x0000_s1026" style="position:absolute;margin-left:0;margin-top:0;width:540pt;height:556.55pt;z-index:-251662336;mso-width-percent:1154;mso-height-percent:670;mso-top-percent:45;mso-position-horizontal:center;mso-position-horizontal-relative:margin;mso-position-vertical-relative:page;mso-width-percent:1154;mso-height-percent:670;mso-top-percent:45;mso-width-relative:margin" coordsize="55613,54044" o:gfxdata="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">
-                    <o:lock v:ext="edit" aspectratio="t"/>
-                    <v:shape id="Forma libre 10" o:spid="_x0000_s1027" style="position:absolute;width:55575;height:54044;visibility:visible;mso-wrap-style:square;v-text-anchor:bottom" coordsize="720,700" o:spt="100" o:gfxdata="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" adj="-11796480,,5400" path="m,c,644,,644,,644v23,6,62,14,113,21c250,685,476,700,720,644v,-27,,-27,,-27c720,,720,,720,,,,,,,e" fillcolor="#2d69b5 [2578]" stroked="f">
-                      <v:fill color2="#091525 [962]" rotate="t" focusposition=".5,.5" focussize="" focus="100%" type="gradientRadial"/>
-                      <v:stroke joinstyle="miter"/>
-                      <v:formulas/>
-                      <v:path arrowok="t" o:connecttype="custom" o:connectlocs="0,0;0,4972126;872222,5134261;5557520,4972126;5557520,4763667;5557520,0;0,0" o:connectangles="0,0,0,0,0,0,0" textboxrect="0,0,720,700"/>
-                      <v:textbox inset="1in,86.4pt,86.4pt,86.4pt">
-                        <w:txbxContent>
-                          <w:p>
-                            <w:pPr>
-                              <w:rPr>
-                                <w:color w:val="FFFFFF" w:themeColor="background1"/>
-                                <w:sz w:val="72"/>
-                                <w:szCs w:val="72"/>
-                              </w:rPr>
-                            </w:pPr>
-                            <w:sdt>
-                              <w:sdtPr>
-                                <w:rPr>
-                                  <w:color w:val="FFFFFF" w:themeColor="background1"/>
-                                  <w:sz w:val="72"/>
-                                  <w:szCs w:val="72"/>
-                                </w:rPr>
-                                <w:alias w:val="Título"/>
-                                <w:tag w:val=""/>
-                                <w:id w:val="-554696155"/>
-                                <w:dataBinding w:prefixMappings="xmlns:ns0='http://purl.org/dc/elements/1.1/' xmlns:ns1='http://schemas.openxmlformats.org/package/2006/metadata/core-properties' " w:xpath="/ns1:coreProperties[1]/ns0:title[1]" w:storeItemID="{6C3C8BC8-F283-45AE-878A-BAB7291924A1}"/>
-                                <w:text/>
-                              </w:sdtPr>
-                              <w:sdtContent>
-                                <w:r>
-                                  <w:rPr>
-                                    <w:color w:val="FFFFFF" w:themeColor="background1"/>
-                                    <w:sz w:val="72"/>
-                                    <w:szCs w:val="72"/>
-                                  </w:rPr>
-                                  <w:t>Guia d’ús KarmaWEBAPI</w:t>
-                                </w:r>
-                              </w:sdtContent>
-                            </w:sdt>
-                          </w:p>
-                        </w:txbxContent>
-                      </v:textbox>
+                  <v:group w14:anchorId="1664E157" id="Grupo 149" o:spid="_x0000_s1026" style="position:absolute;margin-left:0;margin-top:0;width:8in;height:95.7pt;z-index:251662336;mso-width-percent:941;mso-height-percent:121;mso-top-percent:23;mso-position-horizontal:center;mso-position-horizontal-relative:page;mso-position-vertical-relative:page;mso-width-percent:941;mso-height-percent:121;mso-top-percent:23" coordorigin="" coordsize="73152,12161" o:gfxdata="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">
+                    <v:shape id="Rectángulo 51" o:spid="_x0000_s1027" style="position:absolute;width:73152;height:11303;visibility:visible;mso-wrap-style:square;v-text-anchor:middle" coordsize="7312660,1129665" o:gfxdata="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" path="m,l7312660,r,1129665l3619500,733425,,1091565,,xe" fillcolor="#4f81bd [3204]" stroked="f" strokeweight="2pt">
+                      <v:path arrowok="t" o:connecttype="custom" o:connectlocs="0,0;7315200,0;7315200,1130373;3620757,733885;0,1092249;0,0" o:connectangles="0,0,0,0,0,0"/>
                     </v:shape>
-                    <v:shape id="Forma libre 11" o:spid="_x0000_s1028" style="position:absolute;left:8763;top:47697;width:46850;height:5099;visibility:visible;mso-wrap-style:square;v-text-anchor:bottom" coordsize="607,66" o:gfxdata="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" path="m607,c450,44,300,57,176,57,109,57,49,53,,48,66,58,152,66,251,66,358,66,480,56,607,27,607,,607,,607,e" fillcolor="white [3212]" stroked="f">
-                      <v:fill opacity="19789f"/>
-                      <v:path arrowok="t" o:connecttype="custom" o:connectlocs="4685030,0;1358427,440373;0,370840;1937302,509905;4685030,208598;4685030,0" o:connectangles="0,0,0,0,0,0"/>
-                    </v:shape>
-                    <w10:wrap anchorx="margin" anchory="page"/>
+                    <v:rect id="Rectángulo 151" o:spid="_x0000_s1028" style="position:absolute;width:73152;height:12161;visibility:visible;mso-wrap-style:square;v-text-anchor:middle" o:gfxdata="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" stroked="f" strokeweight="2pt">
+                      <v:fill r:id="rId10" o:title="" recolor="t" rotate="t" type="frame"/>
+                    </v:rect>
+                    <w10:wrap anchorx="page" anchory="page"/>
                   </v:group>
                 </w:pict>
               </mc:Fallback>
@@ -405,23 +288,31 @@
           <w:r>
             <w:rPr>
               <w:noProof/>
-              <w:lang w:val="ca-ES"/>
             </w:rPr>
             <mc:AlternateContent>
               <mc:Choice Requires="wps">
                 <w:drawing>
-                  <wp:anchor distT="0" distB="0" distL="114300" distR="114300" simplePos="0" relativeHeight="251660288" behindDoc="0" locked="0" layoutInCell="1" allowOverlap="1" wp14:anchorId="7D7971D9" wp14:editId="37117DA8">
+                  <wp:anchor distT="0" distB="0" distL="114300" distR="114300" simplePos="0" relativeHeight="251660288" behindDoc="0" locked="0" layoutInCell="1" allowOverlap="1" wp14:anchorId="25B94A56" wp14:editId="50658D66">
                     <wp:simplePos x="0" y="0"/>
                     <wp:positionH relativeFrom="page">
                       <wp:align>center</wp:align>
                     </wp:positionH>
-                    <wp:positionV relativeFrom="margin">
-                      <wp:align>bottom</wp:align>
-                    </wp:positionV>
-                    <wp:extent cx="5753100" cy="146304"/>
-                    <wp:effectExtent l="0" t="0" r="0" b="5715"/>
+                    <mc:AlternateContent>
+                      <mc:Choice Requires="wp14">
+                        <wp:positionV relativeFrom="page">
+                          <wp14:pctPosVOffset>81800</wp14:pctPosVOffset>
+                        </wp:positionV>
+                      </mc:Choice>
+                      <mc:Fallback>
+                        <wp:positionV relativeFrom="page">
+                          <wp:posOffset>8227695</wp:posOffset>
+                        </wp:positionV>
+                      </mc:Fallback>
+                    </mc:AlternateContent>
+                    <wp:extent cx="7315200" cy="914400"/>
+                    <wp:effectExtent l="0" t="0" r="0" b="8255"/>
                     <wp:wrapSquare wrapText="bothSides"/>
-                    <wp:docPr id="128" name="Cuadro de texto 128"/>
+                    <wp:docPr id="152" name="Cuadro de texto 152"/>
                     <wp:cNvGraphicFramePr/>
                     <a:graphic xmlns:a="http://schemas.openxmlformats.org/drawingml/2006/main">
                       <a:graphicData uri="http://schemas.microsoft.com/office/word/2010/wordprocessingShape">
@@ -430,7 +321,229 @@
                           <wps:spPr>
                             <a:xfrm>
                               <a:off x="0" y="0"/>
-                              <a:ext cx="5753100" cy="146304"/>
+                              <a:ext cx="7315200" cy="914400"/>
+                            </a:xfrm>
+                            <a:prstGeom prst="rect">
+                              <a:avLst/>
+                            </a:prstGeom>
+                            <a:noFill/>
+                            <a:ln w="6350">
+                              <a:noFill/>
+                            </a:ln>
+                            <a:effectLst/>
+                          </wps:spPr>
+                          <wps:style>
+                            <a:lnRef idx="0">
+                              <a:schemeClr val="accent1"/>
+                            </a:lnRef>
+                            <a:fillRef idx="0">
+                              <a:schemeClr val="accent1"/>
+                            </a:fillRef>
+                            <a:effectRef idx="0">
+                              <a:schemeClr val="accent1"/>
+                            </a:effectRef>
+                            <a:fontRef idx="minor">
+                              <a:schemeClr val="dk1"/>
+                            </a:fontRef>
+                          </wps:style>
+                          <wps:txbx>
+                            <w:txbxContent>
+                              <w:sdt>
+                                <w:sdtPr>
+                                  <w:rPr>
+                                    <w:color w:val="595959" w:themeColor="text1" w:themeTint="A6"/>
+                                    <w:sz w:val="28"/>
+                                    <w:szCs w:val="28"/>
+                                    <w:lang w:val="es-ES"/>
+                                  </w:rPr>
+                                  <w:alias w:val="Autor"/>
+                                  <w:tag w:val=""/>
+                                  <w:id w:val="789243997"/>
+                                  <w:dataBinding w:prefixMappings="xmlns:ns0='http://purl.org/dc/elements/1.1/' xmlns:ns1='http://schemas.openxmlformats.org/package/2006/metadata/core-properties' " w:xpath="/ns1:coreProperties[1]/ns0:creator[1]" w:storeItemID="{6C3C8BC8-F283-45AE-878A-BAB7291924A1}"/>
+                                  <w:text/>
+                                </w:sdtPr>
+                                <w:sdtContent>
+                                  <w:p>
+                                    <w:pPr>
+                                      <w:pStyle w:val="Senseespaiat"/>
+                                      <w:jc w:val="right"/>
+                                      <w:rPr>
+                                        <w:color w:val="595959" w:themeColor="text1" w:themeTint="A6"/>
+                                        <w:sz w:val="28"/>
+                                        <w:szCs w:val="28"/>
+                                        <w:lang w:val="es-ES"/>
+                                      </w:rPr>
+                                    </w:pPr>
+                                    <w:r>
+                                      <w:rPr>
+                                        <w:color w:val="595959" w:themeColor="text1" w:themeTint="A6"/>
+                                        <w:sz w:val="28"/>
+                                        <w:szCs w:val="28"/>
+                                        <w:lang w:val="es-ES"/>
+                                      </w:rPr>
+                                      <w:t>Sofia Marti Rodriguez</w:t>
+                                    </w:r>
+                                  </w:p>
+                                </w:sdtContent>
+                              </w:sdt>
+                              <w:p>
+                                <w:pPr>
+                                  <w:pStyle w:val="Senseespaiat"/>
+                                  <w:jc w:val="right"/>
+                                  <w:rPr>
+                                    <w:color w:val="595959" w:themeColor="text1" w:themeTint="A6"/>
+                                    <w:sz w:val="18"/>
+                                    <w:szCs w:val="18"/>
+                                    <w:lang w:val="es-ES"/>
+                                  </w:rPr>
+                                </w:pPr>
+                                <w:hyperlink r:id="rId11" w:history="1">
+                                  <w:r>
+                                    <w:rPr>
+                                      <w:rStyle w:val="Enlla"/>
+                                      <w:sz w:val="18"/>
+                                      <w:szCs w:val="18"/>
+                                      <w:lang w:val="es-ES"/>
+                                    </w:rPr>
+                                    <w:t>somarrod@alumni.upv.es</w:t>
+                                  </w:r>
+                                </w:hyperlink>
+                              </w:p>
+                            </w:txbxContent>
+                          </wps:txbx>
+                          <wps:bodyPr rot="0" spcFirstLastPara="0" vertOverflow="overflow" horzOverflow="overflow" vert="horz" wrap="square" lIns="1600200" tIns="0" rIns="685800" bIns="0" numCol="1" spcCol="0" rtlCol="0" fromWordArt="0" anchor="b" anchorCtr="0" forceAA="0" compatLnSpc="1">
+                            <a:prstTxWarp prst="textNoShape">
+                              <a:avLst/>
+                            </a:prstTxWarp>
+                            <a:noAutofit/>
+                          </wps:bodyPr>
+                        </wps:wsp>
+                      </a:graphicData>
+                    </a:graphic>
+                    <wp14:sizeRelH relativeFrom="page">
+                      <wp14:pctWidth>94100</wp14:pctWidth>
+                    </wp14:sizeRelH>
+                    <wp14:sizeRelV relativeFrom="page">
+                      <wp14:pctHeight>9200</wp14:pctHeight>
+                    </wp14:sizeRelV>
+                  </wp:anchor>
+                </w:drawing>
+              </mc:Choice>
+              <mc:Fallback>
+                <w:pict>
+                  <v:shapetype w14:anchorId="25B94A56" id="_x0000_t202" coordsize="21600,21600" o:spt="202" path="m,l,21600r21600,l21600,xe">
+                    <v:stroke joinstyle="miter"/>
+                    <v:path gradientshapeok="t" o:connecttype="rect"/>
+                  </v:shapetype>
+                  <v:shape id="Cuadro de texto 152" o:spid="_x0000_s1026" type="#_x0000_t202" style="position:absolute;margin-left:0;margin-top:0;width:8in;height:1in;z-index:251660288;visibility:visible;mso-wrap-style:square;mso-width-percent:941;mso-height-percent:92;mso-top-percent:818;mso-wrap-distance-left:9pt;mso-wrap-distance-top:0;mso-wrap-distance-right:9pt;mso-wrap-distance-bottom:0;mso-position-horizontal:center;mso-position-horizontal-relative:page;mso-position-vertical-relative:page;mso-width-percent:941;mso-height-percent:92;mso-top-percent:818;mso-width-relative:page;mso-height-relative:page;v-text-anchor:bottom" o:gfxdata="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" filled="f" stroked="f" strokeweight=".5pt">
+                    <v:textbox inset="126pt,0,54pt,0">
+                      <w:txbxContent>
+                        <w:sdt>
+                          <w:sdtPr>
+                            <w:rPr>
+                              <w:color w:val="595959" w:themeColor="text1" w:themeTint="A6"/>
+                              <w:sz w:val="28"/>
+                              <w:szCs w:val="28"/>
+                              <w:lang w:val="es-ES"/>
+                            </w:rPr>
+                            <w:alias w:val="Autor"/>
+                            <w:tag w:val=""/>
+                            <w:id w:val="789243997"/>
+                            <w:dataBinding w:prefixMappings="xmlns:ns0='http://purl.org/dc/elements/1.1/' xmlns:ns1='http://schemas.openxmlformats.org/package/2006/metadata/core-properties' " w:xpath="/ns1:coreProperties[1]/ns0:creator[1]" w:storeItemID="{6C3C8BC8-F283-45AE-878A-BAB7291924A1}"/>
+                            <w:text/>
+                          </w:sdtPr>
+                          <w:sdtContent>
+                            <w:p>
+                              <w:pPr>
+                                <w:pStyle w:val="Senseespaiat"/>
+                                <w:jc w:val="right"/>
+                                <w:rPr>
+                                  <w:color w:val="595959" w:themeColor="text1" w:themeTint="A6"/>
+                                  <w:sz w:val="28"/>
+                                  <w:szCs w:val="28"/>
+                                  <w:lang w:val="es-ES"/>
+                                </w:rPr>
+                              </w:pPr>
+                              <w:r>
+                                <w:rPr>
+                                  <w:color w:val="595959" w:themeColor="text1" w:themeTint="A6"/>
+                                  <w:sz w:val="28"/>
+                                  <w:szCs w:val="28"/>
+                                  <w:lang w:val="es-ES"/>
+                                </w:rPr>
+                                <w:t>Sofia Marti Rodriguez</w:t>
+                              </w:r>
+                            </w:p>
+                          </w:sdtContent>
+                        </w:sdt>
+                        <w:p>
+                          <w:pPr>
+                            <w:pStyle w:val="Senseespaiat"/>
+                            <w:jc w:val="right"/>
+                            <w:rPr>
+                              <w:color w:val="595959" w:themeColor="text1" w:themeTint="A6"/>
+                              <w:sz w:val="18"/>
+                              <w:szCs w:val="18"/>
+                              <w:lang w:val="es-ES"/>
+                            </w:rPr>
+                          </w:pPr>
+                          <w:hyperlink r:id="rId12" w:history="1">
+                            <w:r>
+                              <w:rPr>
+                                <w:rStyle w:val="Enlla"/>
+                                <w:sz w:val="18"/>
+                                <w:szCs w:val="18"/>
+                                <w:lang w:val="es-ES"/>
+                              </w:rPr>
+                              <w:t>somarrod@alumni.upv.es</w:t>
+                            </w:r>
+                          </w:hyperlink>
+                        </w:p>
+                      </w:txbxContent>
+                    </v:textbox>
+                    <w10:wrap type="square" anchorx="page" anchory="page"/>
+                  </v:shape>
+                </w:pict>
+              </mc:Fallback>
+            </mc:AlternateContent>
+          </w:r>
+          <w:r>
+            <w:rPr>
+              <w:noProof/>
+            </w:rPr>
+            <mc:AlternateContent>
+              <mc:Choice Requires="wps">
+                <w:drawing>
+                  <wp:anchor distT="0" distB="0" distL="114300" distR="114300" simplePos="0" relativeHeight="251661312" behindDoc="0" locked="0" layoutInCell="1" allowOverlap="1" wp14:anchorId="62EE58D2" wp14:editId="6CD2572A">
+                    <wp:simplePos x="0" y="0"/>
+                    <wp:positionH relativeFrom="page">
+                      <wp:align>center</wp:align>
+                    </wp:positionH>
+                    <mc:AlternateContent>
+                      <mc:Choice Requires="wp14">
+                        <wp:positionV relativeFrom="page">
+                          <wp14:pctPosVOffset>70000</wp14:pctPosVOffset>
+                        </wp:positionV>
+                      </mc:Choice>
+                      <mc:Fallback>
+                        <wp:positionV relativeFrom="page">
+                          <wp:posOffset>7040880</wp:posOffset>
+                        </wp:positionV>
+                      </mc:Fallback>
+                    </mc:AlternateContent>
+                    <wp:extent cx="7315200" cy="1009650"/>
+                    <wp:effectExtent l="0" t="0" r="0" b="0"/>
+                    <wp:wrapSquare wrapText="bothSides"/>
+                    <wp:docPr id="153" name="Cuadro de texto 153"/>
+                    <wp:cNvGraphicFramePr/>
+                    <a:graphic xmlns:a="http://schemas.openxmlformats.org/drawingml/2006/main">
+                      <a:graphicData uri="http://schemas.microsoft.com/office/word/2010/wordprocessingShape">
+                        <wps:wsp>
+                          <wps:cNvSpPr txBox="1"/>
+                          <wps:spPr>
+                            <a:xfrm>
+                              <a:off x="0" y="0"/>
+                              <a:ext cx="7315200" cy="1009650"/>
                             </a:xfrm>
                             <a:prstGeom prst="rect">
                               <a:avLst/>
@@ -462,33 +575,112 @@
                                   <w:pStyle w:val="Senseespaiat"/>
                                   <w:jc w:val="right"/>
                                   <w:rPr>
-                                    <w:color w:val="7F7F7F" w:themeColor="text1" w:themeTint="80"/>
-                                    <w:sz w:val="18"/>
-                                    <w:szCs w:val="18"/>
+                                    <w:color w:val="4F81BD" w:themeColor="accent1"/>
+                                    <w:sz w:val="28"/>
+                                    <w:szCs w:val="28"/>
+                                    <w:lang w:val="es-ES"/>
                                   </w:rPr>
                                 </w:pPr>
+                                <w:proofErr w:type="spellStart"/>
                                 <w:r>
                                   <w:rPr>
-                                    <w:caps/>
-                                    <w:color w:val="7F7F7F" w:themeColor="text1" w:themeTint="80"/>
-                                    <w:sz w:val="18"/>
-                                    <w:szCs w:val="18"/>
+                                    <w:color w:val="4F81BD" w:themeColor="accent1"/>
+                                    <w:sz w:val="28"/>
+                                    <w:szCs w:val="28"/>
+                                    <w:lang w:val="es-ES"/>
                                   </w:rPr>
-                                  <w:t xml:space="preserve">tREBALL FINAL DE MÀSTER – </w:t>
+                                  <w:t>Descripció</w:t>
                                 </w:r>
+                                <w:proofErr w:type="spellEnd"/>
                                 <w:r>
                                   <w:rPr>
-                                    <w:caps/>
-                                    <w:color w:val="7F7F7F" w:themeColor="text1" w:themeTint="80"/>
-                                    <w:sz w:val="18"/>
-                                    <w:szCs w:val="18"/>
+                                    <w:color w:val="4F81BD" w:themeColor="accent1"/>
+                                    <w:sz w:val="28"/>
+                                    <w:szCs w:val="28"/>
+                                    <w:lang w:val="es-ES"/>
                                   </w:rPr>
-                                  <w:t>UPV CAMPUS GANDIA</w:t>
+                                  <w:t xml:space="preserve"> </w:t>
                                 </w:r>
+                                <w:proofErr w:type="spellStart"/>
+                                <w:r>
+                                  <w:rPr>
+                                    <w:color w:val="4F81BD" w:themeColor="accent1"/>
+                                    <w:sz w:val="28"/>
+                                    <w:szCs w:val="28"/>
+                                    <w:lang w:val="es-ES"/>
+                                  </w:rPr>
+                                  <w:t>breu</w:t>
+                                </w:r>
+                                <w:proofErr w:type="spellEnd"/>
                               </w:p>
+                              <w:sdt>
+                                <w:sdtPr>
+                                  <w:rPr>
+                                    <w:lang w:val="es-ES"/>
+                                  </w:rPr>
+                                  <w:alias w:val="Descripción breve"/>
+                                  <w:tag w:val=""/>
+                                  <w:id w:val="1375273687"/>
+                                  <w:dataBinding w:prefixMappings="xmlns:ns0='http://schemas.microsoft.com/office/2006/coverPageProps' " w:xpath="/ns0:CoverPageProperties[1]/ns0:Abstract[1]" w:storeItemID="{55AF091B-3C7A-41E3-B477-F2FDAA23CFDA}"/>
+                                  <w:text w:multiLine="1"/>
+                                </w:sdtPr>
+                                <w:sdtContent>
+                                  <w:p>
+                                    <w:pPr>
+                                      <w:pStyle w:val="Senseespaiat"/>
+                                      <w:jc w:val="right"/>
+                                      <w:rPr>
+                                        <w:lang w:val="es-ES"/>
+                                      </w:rPr>
+                                    </w:pPr>
+                                    <w:r>
+                                      <w:rPr>
+                                        <w:lang w:val="es-ES"/>
+                                      </w:rPr>
+                                      <w:t xml:space="preserve">Manual funcional per al </w:t>
+                                    </w:r>
+                                    <w:proofErr w:type="spellStart"/>
+                                    <w:r>
+                                      <w:rPr>
+                                        <w:lang w:val="es-ES"/>
+                                      </w:rPr>
+                                      <w:t>consum</w:t>
+                                    </w:r>
+                                    <w:proofErr w:type="spellEnd"/>
+                                    <w:r>
+                                      <w:rPr>
+                                        <w:lang w:val="es-ES"/>
+                                      </w:rPr>
+                                      <w:t xml:space="preserve"> de </w:t>
+                                    </w:r>
+                                    <w:proofErr w:type="spellStart"/>
+                                    <w:r>
+                                      <w:rPr>
+                                        <w:lang w:val="es-ES"/>
+                                      </w:rPr>
+                                      <w:t>l’API</w:t>
+                                    </w:r>
+                                    <w:proofErr w:type="spellEnd"/>
+                                    <w:r>
+                                      <w:rPr>
+                                        <w:lang w:val="es-ES"/>
+                                      </w:rPr>
+                                      <w:t xml:space="preserve"> REST </w:t>
+                                    </w:r>
+                                    <w:proofErr w:type="spellStart"/>
+                                    <w:r>
+                                      <w:rPr>
+                                        <w:lang w:val="es-ES"/>
+                                      </w:rPr>
+                                      <w:t>KarmaWEBAPI</w:t>
+                                    </w:r>
+                                    <w:proofErr w:type="spellEnd"/>
+                                  </w:p>
+                                </w:sdtContent>
+                              </w:sdt>
                             </w:txbxContent>
                           </wps:txbx>
-                          <wps:bodyPr rot="0" spcFirstLastPara="0" vertOverflow="overflow" horzOverflow="overflow" vert="horz" wrap="square" lIns="914400" tIns="0" rIns="1097280" bIns="0" numCol="1" spcCol="0" rtlCol="0" fromWordArt="0" anchor="b" anchorCtr="0" forceAA="0" compatLnSpc="1">
+                          <wps:bodyPr rot="0" spcFirstLastPara="0" vertOverflow="overflow" horzOverflow="overflow" vert="horz" wrap="square" lIns="1600200" tIns="0" rIns="685800" bIns="0" numCol="1" spcCol="0" rtlCol="0" fromWordArt="0" anchor="t" anchorCtr="0" forceAA="0" compatLnSpc="1">
                             <a:prstTxWarp prst="textNoShape">
                               <a:avLst/>
                             </a:prstTxWarp>
@@ -497,56 +689,131 @@
                         </wps:wsp>
                       </a:graphicData>
                     </a:graphic>
-                    <wp14:sizeRelH relativeFrom="margin">
-                      <wp14:pctWidth>115400</wp14:pctWidth>
+                    <wp14:sizeRelH relativeFrom="page">
+                      <wp14:pctWidth>94100</wp14:pctWidth>
                     </wp14:sizeRelH>
-                    <wp14:sizeRelV relativeFrom="margin">
-                      <wp14:pctHeight>0</wp14:pctHeight>
+                    <wp14:sizeRelV relativeFrom="page">
+                      <wp14:pctHeight>10000</wp14:pctHeight>
                     </wp14:sizeRelV>
                   </wp:anchor>
                 </w:drawing>
               </mc:Choice>
               <mc:Fallback>
                 <w:pict>
-                  <v:shapetype w14:anchorId="7D7971D9" id="_x0000_t202" coordsize="21600,21600" o:spt="202" path="m,l,21600r21600,l21600,xe">
-                    <v:stroke joinstyle="miter"/>
-                    <v:path gradientshapeok="t" o:connecttype="rect"/>
-                  </v:shapetype>
-                  <v:shape id="Cuadro de texto 128" o:spid="_x0000_s1029" type="#_x0000_t202" style="position:absolute;margin-left:0;margin-top:0;width:453pt;height:11.5pt;z-index:251660288;visibility:visible;mso-wrap-style:square;mso-width-percent:1154;mso-height-percent:0;mso-wrap-distance-left:9pt;mso-wrap-distance-top:0;mso-wrap-distance-right:9pt;mso-wrap-distance-bottom:0;mso-position-horizontal:center;mso-position-horizontal-relative:page;mso-position-vertical:bottom;mso-position-vertical-relative:margin;mso-width-percent:1154;mso-height-percent:0;mso-width-relative:margin;mso-height-relative:margin;v-text-anchor:bottom" o:gfxdata="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" filled="f" stroked="f" strokeweight=".5pt">
-                    <v:textbox style="mso-fit-shape-to-text:t" inset="1in,0,86.4pt,0">
+                  <v:shape w14:anchorId="62EE58D2" id="Cuadro de texto 153" o:spid="_x0000_s1027" type="#_x0000_t202" style="position:absolute;margin-left:0;margin-top:0;width:8in;height:79.5pt;z-index:251661312;visibility:visible;mso-wrap-style:square;mso-width-percent:941;mso-height-percent:100;mso-top-percent:700;mso-wrap-distance-left:9pt;mso-wrap-distance-top:0;mso-wrap-distance-right:9pt;mso-wrap-distance-bottom:0;mso-position-horizontal:center;mso-position-horizontal-relative:page;mso-position-vertical-relative:page;mso-width-percent:941;mso-height-percent:100;mso-top-percent:700;mso-width-relative:page;mso-height-relative:page;v-text-anchor:top" o:gfxdata="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" filled="f" stroked="f" strokeweight=".5pt">
+                    <v:textbox style="mso-fit-shape-to-text:t" inset="126pt,0,54pt,0">
                       <w:txbxContent>
                         <w:p>
                           <w:pPr>
                             <w:pStyle w:val="Senseespaiat"/>
                             <w:jc w:val="right"/>
                             <w:rPr>
-                              <w:color w:val="7F7F7F" w:themeColor="text1" w:themeTint="80"/>
-                              <w:sz w:val="18"/>
-                              <w:szCs w:val="18"/>
+                              <w:color w:val="4F81BD" w:themeColor="accent1"/>
+                              <w:sz w:val="28"/>
+                              <w:szCs w:val="28"/>
+                              <w:lang w:val="es-ES"/>
                             </w:rPr>
                           </w:pPr>
+                          <w:proofErr w:type="spellStart"/>
                           <w:r>
                             <w:rPr>
-                              <w:caps/>
-                              <w:color w:val="7F7F7F" w:themeColor="text1" w:themeTint="80"/>
-                              <w:sz w:val="18"/>
-                              <w:szCs w:val="18"/>
+                              <w:color w:val="4F81BD" w:themeColor="accent1"/>
+                              <w:sz w:val="28"/>
+                              <w:szCs w:val="28"/>
+                              <w:lang w:val="es-ES"/>
                             </w:rPr>
-                            <w:t xml:space="preserve">tREBALL FINAL DE MÀSTER – </w:t>
+                            <w:t>Descripció</w:t>
                           </w:r>
+                          <w:proofErr w:type="spellEnd"/>
                           <w:r>
                             <w:rPr>
-                              <w:caps/>
-                              <w:color w:val="7F7F7F" w:themeColor="text1" w:themeTint="80"/>
-                              <w:sz w:val="18"/>
-                              <w:szCs w:val="18"/>
+                              <w:color w:val="4F81BD" w:themeColor="accent1"/>
+                              <w:sz w:val="28"/>
+                              <w:szCs w:val="28"/>
+                              <w:lang w:val="es-ES"/>
                             </w:rPr>
-                            <w:t>UPV CAMPUS GANDIA</w:t>
+                            <w:t xml:space="preserve"> </w:t>
                           </w:r>
+                          <w:proofErr w:type="spellStart"/>
+                          <w:r>
+                            <w:rPr>
+                              <w:color w:val="4F81BD" w:themeColor="accent1"/>
+                              <w:sz w:val="28"/>
+                              <w:szCs w:val="28"/>
+                              <w:lang w:val="es-ES"/>
+                            </w:rPr>
+                            <w:t>breu</w:t>
+                          </w:r>
+                          <w:proofErr w:type="spellEnd"/>
                         </w:p>
+                        <w:sdt>
+                          <w:sdtPr>
+                            <w:rPr>
+                              <w:lang w:val="es-ES"/>
+                            </w:rPr>
+                            <w:alias w:val="Descripción breve"/>
+                            <w:tag w:val=""/>
+                            <w:id w:val="1375273687"/>
+                            <w:dataBinding w:prefixMappings="xmlns:ns0='http://schemas.microsoft.com/office/2006/coverPageProps' " w:xpath="/ns0:CoverPageProperties[1]/ns0:Abstract[1]" w:storeItemID="{55AF091B-3C7A-41E3-B477-F2FDAA23CFDA}"/>
+                            <w:text w:multiLine="1"/>
+                          </w:sdtPr>
+                          <w:sdtContent>
+                            <w:p>
+                              <w:pPr>
+                                <w:pStyle w:val="Senseespaiat"/>
+                                <w:jc w:val="right"/>
+                                <w:rPr>
+                                  <w:lang w:val="es-ES"/>
+                                </w:rPr>
+                              </w:pPr>
+                              <w:r>
+                                <w:rPr>
+                                  <w:lang w:val="es-ES"/>
+                                </w:rPr>
+                                <w:t xml:space="preserve">Manual funcional per al </w:t>
+                              </w:r>
+                              <w:proofErr w:type="spellStart"/>
+                              <w:r>
+                                <w:rPr>
+                                  <w:lang w:val="es-ES"/>
+                                </w:rPr>
+                                <w:t>consum</w:t>
+                              </w:r>
+                              <w:proofErr w:type="spellEnd"/>
+                              <w:r>
+                                <w:rPr>
+                                  <w:lang w:val="es-ES"/>
+                                </w:rPr>
+                                <w:t xml:space="preserve"> de </w:t>
+                              </w:r>
+                              <w:proofErr w:type="spellStart"/>
+                              <w:r>
+                                <w:rPr>
+                                  <w:lang w:val="es-ES"/>
+                                </w:rPr>
+                                <w:t>l’API</w:t>
+                              </w:r>
+                              <w:proofErr w:type="spellEnd"/>
+                              <w:r>
+                                <w:rPr>
+                                  <w:lang w:val="es-ES"/>
+                                </w:rPr>
+                                <w:t xml:space="preserve"> REST </w:t>
+                              </w:r>
+                              <w:proofErr w:type="spellStart"/>
+                              <w:r>
+                                <w:rPr>
+                                  <w:lang w:val="es-ES"/>
+                                </w:rPr>
+                                <w:t>KarmaWEBAPI</w:t>
+                              </w:r>
+                              <w:proofErr w:type="spellEnd"/>
+                            </w:p>
+                          </w:sdtContent>
+                        </w:sdt>
                       </w:txbxContent>
                     </v:textbox>
-                    <w10:wrap type="square" anchorx="page" anchory="margin"/>
+                    <w10:wrap type="square" anchorx="page" anchory="page"/>
                   </v:shape>
                 </w:pict>
               </mc:Fallback>
@@ -555,12 +822,11 @@
           <w:r>
             <w:rPr>
               <w:noProof/>
-              <w:lang w:val="ca-ES"/>
             </w:rPr>
             <mc:AlternateContent>
               <mc:Choice Requires="wps">
                 <w:drawing>
-                  <wp:anchor distT="0" distB="0" distL="114300" distR="114300" simplePos="0" relativeHeight="251658240" behindDoc="0" locked="0" layoutInCell="1" allowOverlap="1" wp14:anchorId="350E5832" wp14:editId="025A388E">
+                  <wp:anchor distT="0" distB="0" distL="114300" distR="114300" simplePos="0" relativeHeight="251659264" behindDoc="0" locked="0" layoutInCell="1" allowOverlap="1" wp14:anchorId="5C66CF28" wp14:editId="6F2616C2">
                     <wp:simplePos x="0" y="0"/>
                     <wp:positionH relativeFrom="page">
                       <wp:align>center</wp:align>
@@ -568,19 +834,19 @@
                     <mc:AlternateContent>
                       <mc:Choice Requires="wp14">
                         <wp:positionV relativeFrom="page">
-                          <wp14:pctPosVOffset>79000</wp14:pctPosVOffset>
+                          <wp14:pctPosVOffset>30000</wp14:pctPosVOffset>
                         </wp:positionV>
                       </mc:Choice>
                       <mc:Fallback>
                         <wp:positionV relativeFrom="page">
-                          <wp:posOffset>7945755</wp:posOffset>
+                          <wp:posOffset>3017520</wp:posOffset>
                         </wp:positionV>
                       </mc:Fallback>
                     </mc:AlternateContent>
-                    <wp:extent cx="5753100" cy="484632"/>
-                    <wp:effectExtent l="0" t="0" r="0" b="7620"/>
+                    <wp:extent cx="7315200" cy="3638550"/>
+                    <wp:effectExtent l="0" t="0" r="0" b="6350"/>
                     <wp:wrapSquare wrapText="bothSides"/>
-                    <wp:docPr id="129" name="Cuadro de texto 129"/>
+                    <wp:docPr id="154" name="Cuadro de texto 154"/>
                     <wp:cNvGraphicFramePr/>
                     <a:graphic xmlns:a="http://schemas.openxmlformats.org/drawingml/2006/main">
                       <a:graphicData uri="http://schemas.microsoft.com/office/word/2010/wordprocessingShape">
@@ -589,7 +855,7 @@
                           <wps:spPr>
                             <a:xfrm>
                               <a:off x="0" y="0"/>
-                              <a:ext cx="5753100" cy="484632"/>
+                              <a:ext cx="7315200" cy="3638550"/>
                             </a:xfrm>
                             <a:prstGeom prst="rect">
                               <a:avLst/>
@@ -616,203 +882,271 @@
                           </wps:style>
                           <wps:txbx>
                             <w:txbxContent>
+                              <w:p>
+                                <w:pPr>
+                                  <w:jc w:val="right"/>
+                                  <w:rPr>
+                                    <w:color w:val="4F81BD" w:themeColor="accent1"/>
+                                    <w:sz w:val="64"/>
+                                    <w:szCs w:val="64"/>
+                                    <w:lang w:val="es-ES"/>
+                                  </w:rPr>
+                                </w:pPr>
+                                <w:sdt>
+                                  <w:sdtPr>
+                                    <w:rPr>
+                                      <w:caps/>
+                                      <w:color w:val="4F81BD" w:themeColor="accent1"/>
+                                      <w:sz w:val="64"/>
+                                      <w:szCs w:val="64"/>
+                                      <w:lang w:val="es-ES"/>
+                                    </w:rPr>
+                                    <w:alias w:val="Título"/>
+                                    <w:tag w:val=""/>
+                                    <w:id w:val="630141079"/>
+                                    <w:dataBinding w:prefixMappings="xmlns:ns0='http://purl.org/dc/elements/1.1/' xmlns:ns1='http://schemas.openxmlformats.org/package/2006/metadata/core-properties' " w:xpath="/ns1:coreProperties[1]/ns0:title[1]" w:storeItemID="{6C3C8BC8-F283-45AE-878A-BAB7291924A1}"/>
+                                    <w:text w:multiLine="1"/>
+                                  </w:sdtPr>
+                                  <w:sdtEndPr>
+                                    <w:rPr>
+                                      <w:caps w:val="0"/>
+                                    </w:rPr>
+                                  </w:sdtEndPr>
+                                  <w:sdtContent>
+                                    <w:r>
+                                      <w:rPr>
+                                        <w:caps/>
+                                        <w:color w:val="4F81BD" w:themeColor="accent1"/>
+                                        <w:sz w:val="64"/>
+                                        <w:szCs w:val="64"/>
+                                        <w:lang w:val="es-ES"/>
+                                      </w:rPr>
+                                      <w:t>Guia d’ús KarmaWEBAPI</w:t>
+                                    </w:r>
+                                  </w:sdtContent>
+                                </w:sdt>
+                              </w:p>
                               <w:sdt>
                                 <w:sdtPr>
                                   <w:rPr>
-                                    <w:rFonts w:asciiTheme="majorHAnsi" w:eastAsiaTheme="majorEastAsia" w:hAnsiTheme="majorHAnsi" w:cstheme="majorBidi"/>
-                                    <w:i/>
-                                    <w:iCs/>
-                                    <w:color w:val="4F81BD" w:themeColor="accent1"/>
-                                    <w:spacing w:val="15"/>
-                                    <w:sz w:val="24"/>
-                                    <w:szCs w:val="24"/>
+                                    <w:color w:val="404040" w:themeColor="text1" w:themeTint="BF"/>
+                                    <w:sz w:val="36"/>
+                                    <w:szCs w:val="36"/>
                                     <w:lang w:val="es-ES"/>
                                   </w:rPr>
                                   <w:alias w:val="Subtítulo"/>
                                   <w:tag w:val=""/>
-                                  <w:id w:val="-1452929454"/>
+                                  <w:id w:val="1759551507"/>
                                   <w:dataBinding w:prefixMappings="xmlns:ns0='http://purl.org/dc/elements/1.1/' xmlns:ns1='http://schemas.openxmlformats.org/package/2006/metadata/core-properties' " w:xpath="/ns1:coreProperties[1]/ns0:subject[1]" w:storeItemID="{6C3C8BC8-F283-45AE-878A-BAB7291924A1}"/>
                                   <w:text/>
                                 </w:sdtPr>
                                 <w:sdtContent>
                                   <w:p>
                                     <w:pPr>
-                                      <w:pStyle w:val="Senseespaiat"/>
-                                      <w:spacing w:before="40" w:after="40"/>
+                                      <w:jc w:val="right"/>
                                       <w:rPr>
-                                        <w:caps/>
-                                        <w:color w:val="4F81BD" w:themeColor="accent1"/>
-                                        <w:sz w:val="28"/>
-                                        <w:szCs w:val="28"/>
+                                        <w:smallCaps/>
+                                        <w:color w:val="404040" w:themeColor="text1" w:themeTint="BF"/>
+                                        <w:sz w:val="36"/>
+                                        <w:szCs w:val="36"/>
                                         <w:lang w:val="es-ES"/>
                                       </w:rPr>
                                     </w:pPr>
+                                    <w:proofErr w:type="spellStart"/>
                                     <w:r>
                                       <w:rPr>
-                                        <w:rFonts w:asciiTheme="majorHAnsi" w:eastAsiaTheme="majorEastAsia" w:hAnsiTheme="majorHAnsi" w:cstheme="majorBidi"/>
-                                        <w:i/>
-                                        <w:iCs/>
-                                        <w:color w:val="4F81BD" w:themeColor="accent1"/>
-                                        <w:spacing w:val="15"/>
-                                        <w:sz w:val="24"/>
-                                        <w:szCs w:val="24"/>
+                                        <w:color w:val="404040" w:themeColor="text1" w:themeTint="BF"/>
+                                        <w:sz w:val="36"/>
+                                        <w:szCs w:val="36"/>
                                         <w:lang w:val="es-ES"/>
                                       </w:rPr>
-                                      <w:t>Manual funcional per al consum de l’API REST KarmaWEBAPI</w:t>
+                                      <w:t>KarmaCli</w:t>
                                     </w:r>
-                                  </w:p>
-                                </w:sdtContent>
-                              </w:sdt>
-                              <w:sdt>
-                                <w:sdtPr>
-                                  <w:rPr>
-                                    <w:caps/>
-                                    <w:color w:val="4BACC6" w:themeColor="accent5"/>
-                                    <w:sz w:val="24"/>
-                                    <w:szCs w:val="24"/>
-                                    <w:lang w:val="es-ES"/>
-                                  </w:rPr>
-                                  <w:alias w:val="Autor"/>
-                                  <w:tag w:val=""/>
-                                  <w:id w:val="-954487662"/>
-                                  <w:dataBinding w:prefixMappings="xmlns:ns0='http://purl.org/dc/elements/1.1/' xmlns:ns1='http://schemas.openxmlformats.org/package/2006/metadata/core-properties' " w:xpath="/ns1:coreProperties[1]/ns0:creator[1]" w:storeItemID="{6C3C8BC8-F283-45AE-878A-BAB7291924A1}"/>
-                                  <w:text/>
-                                </w:sdtPr>
-                                <w:sdtContent>
-                                  <w:p>
-                                    <w:pPr>
-                                      <w:pStyle w:val="Senseespaiat"/>
-                                      <w:spacing w:before="40" w:after="40"/>
+                                    <w:proofErr w:type="spellEnd"/>
+                                    <w:r>
                                       <w:rPr>
-                                        <w:caps/>
-                                        <w:color w:val="4BACC6" w:themeColor="accent5"/>
-                                        <w:sz w:val="24"/>
-                                        <w:szCs w:val="24"/>
+                                        <w:color w:val="404040" w:themeColor="text1" w:themeTint="BF"/>
+                                        <w:sz w:val="36"/>
+                                        <w:szCs w:val="36"/>
                                         <w:lang w:val="es-ES"/>
                                       </w:rPr>
-                                    </w:pPr>
+                                      <w:t xml:space="preserve"> – Quin Karma </w:t>
+                                    </w:r>
+                                    <w:proofErr w:type="spellStart"/>
                                     <w:r>
                                       <w:rPr>
-                                        <w:caps/>
-                                        <w:color w:val="4BACC6" w:themeColor="accent5"/>
-                                        <w:sz w:val="24"/>
-                                        <w:szCs w:val="24"/>
+                                        <w:color w:val="404040" w:themeColor="text1" w:themeTint="BF"/>
+                                        <w:sz w:val="36"/>
+                                        <w:szCs w:val="36"/>
                                         <w:lang w:val="es-ES"/>
                                       </w:rPr>
-                                      <w:t>Sofia Marti Rodriguez</w:t>
+                                      <w:t>tinc</w:t>
+                                    </w:r>
+                                    <w:proofErr w:type="spellEnd"/>
+                                    <w:r>
+                                      <w:rPr>
+                                        <w:color w:val="404040" w:themeColor="text1" w:themeTint="BF"/>
+                                        <w:sz w:val="36"/>
+                                        <w:szCs w:val="36"/>
+                                        <w:lang w:val="es-ES"/>
+                                      </w:rPr>
+                                      <w:t xml:space="preserve"> hui?</w:t>
+                                    </w:r>
+                                    <w:r>
+                                      <w:rPr>
+                                        <w:color w:val="404040" w:themeColor="text1" w:themeTint="BF"/>
+                                        <w:sz w:val="36"/>
+                                        <w:szCs w:val="36"/>
+                                        <w:lang w:val="es-ES"/>
+                                      </w:rPr>
+                                      <w:t xml:space="preserve"> </w:t>
                                     </w:r>
                                   </w:p>
                                 </w:sdtContent>
                               </w:sdt>
                             </w:txbxContent>
                           </wps:txbx>
-                          <wps:bodyPr rot="0" spcFirstLastPara="0" vertOverflow="overflow" horzOverflow="overflow" vert="horz" wrap="square" lIns="914400" tIns="0" rIns="1097280" bIns="0" numCol="1" spcCol="0" rtlCol="0" fromWordArt="0" anchor="t" anchorCtr="0" forceAA="0" compatLnSpc="1">
+                          <wps:bodyPr rot="0" spcFirstLastPara="0" vertOverflow="overflow" horzOverflow="overflow" vert="horz" wrap="square" lIns="1600200" tIns="0" rIns="685800" bIns="0" numCol="1" spcCol="0" rtlCol="0" fromWordArt="0" anchor="b" anchorCtr="0" forceAA="0" compatLnSpc="1">
                             <a:prstTxWarp prst="textNoShape">
                               <a:avLst/>
                             </a:prstTxWarp>
-                            <a:spAutoFit/>
+                            <a:noAutofit/>
                           </wps:bodyPr>
                         </wps:wsp>
                       </a:graphicData>
                     </a:graphic>
-                    <wp14:sizeRelH relativeFrom="margin">
-                      <wp14:pctWidth>115400</wp14:pctWidth>
+                    <wp14:sizeRelH relativeFrom="page">
+                      <wp14:pctWidth>94100</wp14:pctWidth>
                     </wp14:sizeRelH>
-                    <wp14:sizeRelV relativeFrom="margin">
-                      <wp14:pctHeight>0</wp14:pctHeight>
+                    <wp14:sizeRelV relativeFrom="page">
+                      <wp14:pctHeight>36300</wp14:pctHeight>
                     </wp14:sizeRelV>
                   </wp:anchor>
                 </w:drawing>
               </mc:Choice>
               <mc:Fallback>
                 <w:pict>
-                  <v:shape w14:anchorId="350E5832" id="Cuadro de texto 129" o:spid="_x0000_s1030" type="#_x0000_t202" style="position:absolute;margin-left:0;margin-top:0;width:453pt;height:38.15pt;z-index:251658240;visibility:visible;mso-wrap-style:square;mso-width-percent:1154;mso-height-percent:0;mso-top-percent:790;mso-wrap-distance-left:9pt;mso-wrap-distance-top:0;mso-wrap-distance-right:9pt;mso-wrap-distance-bottom:0;mso-position-horizontal:center;mso-position-horizontal-relative:page;mso-position-vertical-relative:page;mso-width-percent:1154;mso-height-percent:0;mso-top-percent:790;mso-width-relative:margin;mso-height-relative:margin;v-text-anchor:top" o:gfxdata="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" filled="f" stroked="f" strokeweight=".5pt">
-                    <v:textbox style="mso-fit-shape-to-text:t" inset="1in,0,86.4pt,0">
+                  <v:shape w14:anchorId="5C66CF28" id="Cuadro de texto 154" o:spid="_x0000_s1028" type="#_x0000_t202" style="position:absolute;margin-left:0;margin-top:0;width:8in;height:286.5pt;z-index:251659264;visibility:visible;mso-wrap-style:square;mso-width-percent:941;mso-height-percent:363;mso-top-percent:300;mso-wrap-distance-left:9pt;mso-wrap-distance-top:0;mso-wrap-distance-right:9pt;mso-wrap-distance-bottom:0;mso-position-horizontal:center;mso-position-horizontal-relative:page;mso-position-vertical-relative:page;mso-width-percent:941;mso-height-percent:363;mso-top-percent:300;mso-width-relative:page;mso-height-relative:page;v-text-anchor:bottom" o:gfxdata="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" filled="f" stroked="f" strokeweight=".5pt">
+                    <v:textbox inset="126pt,0,54pt,0">
                       <w:txbxContent>
+                        <w:p>
+                          <w:pPr>
+                            <w:jc w:val="right"/>
+                            <w:rPr>
+                              <w:color w:val="4F81BD" w:themeColor="accent1"/>
+                              <w:sz w:val="64"/>
+                              <w:szCs w:val="64"/>
+                              <w:lang w:val="es-ES"/>
+                            </w:rPr>
+                          </w:pPr>
+                          <w:sdt>
+                            <w:sdtPr>
+                              <w:rPr>
+                                <w:caps/>
+                                <w:color w:val="4F81BD" w:themeColor="accent1"/>
+                                <w:sz w:val="64"/>
+                                <w:szCs w:val="64"/>
+                                <w:lang w:val="es-ES"/>
+                              </w:rPr>
+                              <w:alias w:val="Título"/>
+                              <w:tag w:val=""/>
+                              <w:id w:val="630141079"/>
+                              <w:dataBinding w:prefixMappings="xmlns:ns0='http://purl.org/dc/elements/1.1/' xmlns:ns1='http://schemas.openxmlformats.org/package/2006/metadata/core-properties' " w:xpath="/ns1:coreProperties[1]/ns0:title[1]" w:storeItemID="{6C3C8BC8-F283-45AE-878A-BAB7291924A1}"/>
+                              <w:text w:multiLine="1"/>
+                            </w:sdtPr>
+                            <w:sdtEndPr>
+                              <w:rPr>
+                                <w:caps w:val="0"/>
+                              </w:rPr>
+                            </w:sdtEndPr>
+                            <w:sdtContent>
+                              <w:r>
+                                <w:rPr>
+                                  <w:caps/>
+                                  <w:color w:val="4F81BD" w:themeColor="accent1"/>
+                                  <w:sz w:val="64"/>
+                                  <w:szCs w:val="64"/>
+                                  <w:lang w:val="es-ES"/>
+                                </w:rPr>
+                                <w:t>Guia d’ús KarmaWEBAPI</w:t>
+                              </w:r>
+                            </w:sdtContent>
+                          </w:sdt>
+                        </w:p>
                         <w:sdt>
                           <w:sdtPr>
                             <w:rPr>
-                              <w:rFonts w:asciiTheme="majorHAnsi" w:eastAsiaTheme="majorEastAsia" w:hAnsiTheme="majorHAnsi" w:cstheme="majorBidi"/>
-                              <w:i/>
-                              <w:iCs/>
-                              <w:color w:val="4F81BD" w:themeColor="accent1"/>
-                              <w:spacing w:val="15"/>
-                              <w:sz w:val="24"/>
-                              <w:szCs w:val="24"/>
+                              <w:color w:val="404040" w:themeColor="text1" w:themeTint="BF"/>
+                              <w:sz w:val="36"/>
+                              <w:szCs w:val="36"/>
                               <w:lang w:val="es-ES"/>
                             </w:rPr>
                             <w:alias w:val="Subtítulo"/>
                             <w:tag w:val=""/>
-                            <w:id w:val="-1452929454"/>
+                            <w:id w:val="1759551507"/>
                             <w:dataBinding w:prefixMappings="xmlns:ns0='http://purl.org/dc/elements/1.1/' xmlns:ns1='http://schemas.openxmlformats.org/package/2006/metadata/core-properties' " w:xpath="/ns1:coreProperties[1]/ns0:subject[1]" w:storeItemID="{6C3C8BC8-F283-45AE-878A-BAB7291924A1}"/>
                             <w:text/>
                           </w:sdtPr>
                           <w:sdtContent>
                             <w:p>
                               <w:pPr>
-                                <w:pStyle w:val="Senseespaiat"/>
-                                <w:spacing w:before="40" w:after="40"/>
+                                <w:jc w:val="right"/>
                                 <w:rPr>
-                                  <w:caps/>
-                                  <w:color w:val="4F81BD" w:themeColor="accent1"/>
-                                  <w:sz w:val="28"/>
-                                  <w:szCs w:val="28"/>
+                                  <w:smallCaps/>
+                                  <w:color w:val="404040" w:themeColor="text1" w:themeTint="BF"/>
+                                  <w:sz w:val="36"/>
+                                  <w:szCs w:val="36"/>
                                   <w:lang w:val="es-ES"/>
                                 </w:rPr>
                               </w:pPr>
+                              <w:proofErr w:type="spellStart"/>
                               <w:r>
                                 <w:rPr>
-                                  <w:rFonts w:asciiTheme="majorHAnsi" w:eastAsiaTheme="majorEastAsia" w:hAnsiTheme="majorHAnsi" w:cstheme="majorBidi"/>
-                                  <w:i/>
-                                  <w:iCs/>
-                                  <w:color w:val="4F81BD" w:themeColor="accent1"/>
-                                  <w:spacing w:val="15"/>
-                                  <w:sz w:val="24"/>
-                                  <w:szCs w:val="24"/>
+                                  <w:color w:val="404040" w:themeColor="text1" w:themeTint="BF"/>
+                                  <w:sz w:val="36"/>
+                                  <w:szCs w:val="36"/>
                                   <w:lang w:val="es-ES"/>
                                 </w:rPr>
-                                <w:t>Manual funcional per al consum de l’API REST KarmaWEBAPI</w:t>
+                                <w:t>KarmaCli</w:t>
                               </w:r>
-                            </w:p>
-                          </w:sdtContent>
-                        </w:sdt>
-                        <w:sdt>
-                          <w:sdtPr>
-                            <w:rPr>
-                              <w:caps/>
-                              <w:color w:val="4BACC6" w:themeColor="accent5"/>
-                              <w:sz w:val="24"/>
-                              <w:szCs w:val="24"/>
-                              <w:lang w:val="es-ES"/>
-                            </w:rPr>
-                            <w:alias w:val="Autor"/>
-                            <w:tag w:val=""/>
-                            <w:id w:val="-954487662"/>
-                            <w:dataBinding w:prefixMappings="xmlns:ns0='http://purl.org/dc/elements/1.1/' xmlns:ns1='http://schemas.openxmlformats.org/package/2006/metadata/core-properties' " w:xpath="/ns1:coreProperties[1]/ns0:creator[1]" w:storeItemID="{6C3C8BC8-F283-45AE-878A-BAB7291924A1}"/>
-                            <w:text/>
-                          </w:sdtPr>
-                          <w:sdtContent>
-                            <w:p>
-                              <w:pPr>
-                                <w:pStyle w:val="Senseespaiat"/>
-                                <w:spacing w:before="40" w:after="40"/>
+                              <w:proofErr w:type="spellEnd"/>
+                              <w:r>
                                 <w:rPr>
-                                  <w:caps/>
-                                  <w:color w:val="4BACC6" w:themeColor="accent5"/>
-                                  <w:sz w:val="24"/>
-                                  <w:szCs w:val="24"/>
+                                  <w:color w:val="404040" w:themeColor="text1" w:themeTint="BF"/>
+                                  <w:sz w:val="36"/>
+                                  <w:szCs w:val="36"/>
                                   <w:lang w:val="es-ES"/>
                                 </w:rPr>
-                              </w:pPr>
+                                <w:t xml:space="preserve"> – Quin Karma </w:t>
+                              </w:r>
+                              <w:proofErr w:type="spellStart"/>
                               <w:r>
                                 <w:rPr>
-                                  <w:caps/>
-                                  <w:color w:val="4BACC6" w:themeColor="accent5"/>
-                                  <w:sz w:val="24"/>
-                                  <w:szCs w:val="24"/>
+                                  <w:color w:val="404040" w:themeColor="text1" w:themeTint="BF"/>
+                                  <w:sz w:val="36"/>
+                                  <w:szCs w:val="36"/>
                                   <w:lang w:val="es-ES"/>
                                 </w:rPr>
-                                <w:t>Sofia Marti Rodriguez</w:t>
+                                <w:t>tinc</w:t>
+                              </w:r>
+                              <w:proofErr w:type="spellEnd"/>
+                              <w:r>
+                                <w:rPr>
+                                  <w:color w:val="404040" w:themeColor="text1" w:themeTint="BF"/>
+                                  <w:sz w:val="36"/>
+                                  <w:szCs w:val="36"/>
+                                  <w:lang w:val="es-ES"/>
+                                </w:rPr>
+                                <w:t xml:space="preserve"> hui?</w:t>
+                              </w:r>
+                              <w:r>
+                                <w:rPr>
+                                  <w:color w:val="404040" w:themeColor="text1" w:themeTint="BF"/>
+                                  <w:sz w:val="36"/>
+                                  <w:szCs w:val="36"/>
+                                  <w:lang w:val="es-ES"/>
+                                </w:rPr>
+                                <w:t xml:space="preserve"> </w:t>
                               </w:r>
                             </w:p>
                           </w:sdtContent>
@@ -825,191 +1159,17 @@
               </mc:Fallback>
             </mc:AlternateContent>
           </w:r>
+        </w:p>
+        <w:p>
+          <w:pPr>
+            <w:rPr>
+              <w:lang w:val="ca-ES"/>
+            </w:rPr>
+          </w:pPr>
           <w:r>
             <w:rPr>
-              <w:noProof/>
-              <w:lang w:val="ca-ES"/>
-            </w:rPr>
-            <mc:AlternateContent>
-              <mc:Choice Requires="wps">
-                <w:drawing>
-                  <wp:anchor distT="0" distB="0" distL="114300" distR="114300" simplePos="0" relativeHeight="251656192" behindDoc="0" locked="0" layoutInCell="1" allowOverlap="1" wp14:anchorId="5A385083" wp14:editId="3D75A2E2">
-                    <wp:simplePos x="0" y="0"/>
-                    <wp:positionH relativeFrom="margin">
-                      <wp:align>right</wp:align>
-                    </wp:positionH>
-                    <mc:AlternateContent>
-                      <mc:Choice Requires="wp14">
-                        <wp:positionV relativeFrom="page">
-                          <wp14:pctPosVOffset>2300</wp14:pctPosVOffset>
-                        </wp:positionV>
-                      </mc:Choice>
-                      <mc:Fallback>
-                        <wp:positionV relativeFrom="page">
-                          <wp:posOffset>231140</wp:posOffset>
-                        </wp:positionV>
-                      </mc:Fallback>
-                    </mc:AlternateContent>
-                    <wp:extent cx="594360" cy="987552"/>
-                    <wp:effectExtent l="0" t="0" r="0" b="5080"/>
-                    <wp:wrapNone/>
-                    <wp:docPr id="130" name="Rectángulo 130"/>
-                    <wp:cNvGraphicFramePr>
-                      <a:graphicFrameLocks xmlns:a="http://schemas.openxmlformats.org/drawingml/2006/main" noChangeAspect="1"/>
-                    </wp:cNvGraphicFramePr>
-                    <a:graphic xmlns:a="http://schemas.openxmlformats.org/drawingml/2006/main">
-                      <a:graphicData uri="http://schemas.microsoft.com/office/word/2010/wordprocessingShape">
-                        <wps:wsp>
-                          <wps:cNvSpPr>
-                            <a:spLocks noChangeAspect="1"/>
-                          </wps:cNvSpPr>
-                          <wps:spPr>
-                            <a:xfrm>
-                              <a:off x="0" y="0"/>
-                              <a:ext cx="594360" cy="987552"/>
-                            </a:xfrm>
-                            <a:prstGeom prst="rect">
-                              <a:avLst/>
-                            </a:prstGeom>
-                            <a:ln>
-                              <a:noFill/>
-                            </a:ln>
-                          </wps:spPr>
-                          <wps:style>
-                            <a:lnRef idx="2">
-                              <a:schemeClr val="accent1">
-                                <a:shade val="50000"/>
-                              </a:schemeClr>
-                            </a:lnRef>
-                            <a:fillRef idx="1">
-                              <a:schemeClr val="accent1"/>
-                            </a:fillRef>
-                            <a:effectRef idx="0">
-                              <a:schemeClr val="accent1"/>
-                            </a:effectRef>
-                            <a:fontRef idx="minor">
-                              <a:schemeClr val="lt1"/>
-                            </a:fontRef>
-                          </wps:style>
-                          <wps:txbx>
-                            <w:txbxContent>
-                              <w:sdt>
-                                <w:sdtPr>
-                                  <w:rPr>
-                                    <w:color w:val="FFFFFF" w:themeColor="background1"/>
-                                    <w:sz w:val="24"/>
-                                    <w:szCs w:val="24"/>
-                                  </w:rPr>
-                                  <w:alias w:val="Año"/>
-                                  <w:tag w:val=""/>
-                                  <w:id w:val="1595126926"/>
-                                  <w:dataBinding w:prefixMappings="xmlns:ns0='http://schemas.microsoft.com/office/2006/coverPageProps' " w:xpath="/ns0:CoverPageProperties[1]/ns0:PublishDate[1]" w:storeItemID="{55AF091B-3C7A-41E3-B477-F2FDAA23CFDA}"/>
-                                  <w:date w:fullDate="2026-01-01T00:00:00Z">
-                                    <w:dateFormat w:val="yyyy"/>
-                                    <w:lid w:val="es-ES"/>
-                                    <w:storeMappedDataAs w:val="dateTime"/>
-                                    <w:calendar w:val="gregorian"/>
-                                  </w:date>
-                                </w:sdtPr>
-                                <w:sdtContent>
-                                  <w:p>
-                                    <w:pPr>
-                                      <w:pStyle w:val="Senseespaiat"/>
-                                      <w:jc w:val="right"/>
-                                      <w:rPr>
-                                        <w:color w:val="FFFFFF" w:themeColor="background1"/>
-                                        <w:sz w:val="24"/>
-                                        <w:szCs w:val="24"/>
-                                      </w:rPr>
-                                    </w:pPr>
-                                    <w:r>
-                                      <w:rPr>
-                                        <w:color w:val="FFFFFF" w:themeColor="background1"/>
-                                        <w:sz w:val="24"/>
-                                        <w:szCs w:val="24"/>
-                                      </w:rPr>
-                                      <w:t>2026</w:t>
-                                    </w:r>
-                                  </w:p>
-                                </w:sdtContent>
-                              </w:sdt>
-                            </w:txbxContent>
-                          </wps:txbx>
-                          <wps:bodyPr rot="0" spcFirstLastPara="0" vertOverflow="overflow" horzOverflow="overflow" vert="horz" wrap="square" lIns="45720" tIns="45720" rIns="45720" bIns="45720" numCol="1" spcCol="0" rtlCol="0" fromWordArt="0" anchor="b" anchorCtr="0" forceAA="0" compatLnSpc="1">
-                            <a:prstTxWarp prst="textNoShape">
-                              <a:avLst/>
-                            </a:prstTxWarp>
-                            <a:noAutofit/>
-                          </wps:bodyPr>
-                        </wps:wsp>
-                      </a:graphicData>
-                    </a:graphic>
-                    <wp14:sizeRelH relativeFrom="page">
-                      <wp14:pctWidth>7600</wp14:pctWidth>
-                    </wp14:sizeRelH>
-                    <wp14:sizeRelV relativeFrom="page">
-                      <wp14:pctHeight>9800</wp14:pctHeight>
-                    </wp14:sizeRelV>
-                  </wp:anchor>
-                </w:drawing>
-              </mc:Choice>
-              <mc:Fallback>
-                <w:pict>
-                  <v:rect w14:anchorId="5A385083" id="Rectángulo 130" o:spid="_x0000_s1031" style="position:absolute;margin-left:-4.4pt;margin-top:0;width:46.8pt;height:77.75pt;z-index:251656192;visibility:visible;mso-wrap-style:square;mso-width-percent:76;mso-height-percent:98;mso-top-percent:23;mso-wrap-distance-left:9pt;mso-wrap-distance-top:0;mso-wrap-distance-right:9pt;mso-wrap-distance-bottom:0;mso-position-horizontal:right;mso-position-horizontal-relative:margin;mso-position-vertical-relative:page;mso-width-percent:76;mso-height-percent:98;mso-top-percent:23;mso-width-relative:page;mso-height-relative:page;v-text-anchor:bottom" o:gfxdata="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" fillcolor="#4f81bd [3204]" stroked="f" strokeweight="2pt">
-                    <o:lock v:ext="edit" aspectratio="t"/>
-                    <v:textbox inset="3.6pt,,3.6pt">
-                      <w:txbxContent>
-                        <w:sdt>
-                          <w:sdtPr>
-                            <w:rPr>
-                              <w:color w:val="FFFFFF" w:themeColor="background1"/>
-                              <w:sz w:val="24"/>
-                              <w:szCs w:val="24"/>
-                            </w:rPr>
-                            <w:alias w:val="Año"/>
-                            <w:tag w:val=""/>
-                            <w:id w:val="1595126926"/>
-                            <w:dataBinding w:prefixMappings="xmlns:ns0='http://schemas.microsoft.com/office/2006/coverPageProps' " w:xpath="/ns0:CoverPageProperties[1]/ns0:PublishDate[1]" w:storeItemID="{55AF091B-3C7A-41E3-B477-F2FDAA23CFDA}"/>
-                            <w:date w:fullDate="2026-01-01T00:00:00Z">
-                              <w:dateFormat w:val="yyyy"/>
-                              <w:lid w:val="es-ES"/>
-                              <w:storeMappedDataAs w:val="dateTime"/>
-                              <w:calendar w:val="gregorian"/>
-                            </w:date>
-                          </w:sdtPr>
-                          <w:sdtContent>
-                            <w:p>
-                              <w:pPr>
-                                <w:pStyle w:val="Senseespaiat"/>
-                                <w:jc w:val="right"/>
-                                <w:rPr>
-                                  <w:color w:val="FFFFFF" w:themeColor="background1"/>
-                                  <w:sz w:val="24"/>
-                                  <w:szCs w:val="24"/>
-                                </w:rPr>
-                              </w:pPr>
-                              <w:r>
-                                <w:rPr>
-                                  <w:color w:val="FFFFFF" w:themeColor="background1"/>
-                                  <w:sz w:val="24"/>
-                                  <w:szCs w:val="24"/>
-                                </w:rPr>
-                                <w:t>2026</w:t>
-                              </w:r>
-                            </w:p>
-                          </w:sdtContent>
-                        </w:sdt>
-                      </w:txbxContent>
-                    </v:textbox>
-                    <w10:wrap anchorx="margin" anchory="page"/>
-                  </v:rect>
-                </w:pict>
-              </mc:Fallback>
-            </mc:AlternateContent>
-          </w:r>
-          <w:r>
-            <w:rPr>
-              <w:lang w:val="ca-ES"/>
+              <w:b/>
+              <w:bCs/>
             </w:rPr>
             <w:br w:type="page"/>
           </w:r>
@@ -1025,6 +1185,7 @@
           <w:color w:val="auto"/>
           <w:sz w:val="22"/>
           <w:szCs w:val="22"/>
+          <w:lang w:val="en-US"/>
         </w:rPr>
         <w:id w:val="608934288"/>
         <w:docPartObj>
@@ -5288,23 +5449,7 @@
                 <w:noProof/>
                 <w:lang w:val="ca-ES"/>
               </w:rPr>
-              <w:t xml:space="preserve">8.6 </w:t>
-            </w:r>
-            <w:r>
-              <w:rPr>
-                <w:rStyle w:val="Enlla"/>
-                <w:noProof/>
-                <w:lang w:val="ca-ES"/>
-              </w:rPr>
-              <w:t>Q</w:t>
-            </w:r>
-            <w:r>
-              <w:rPr>
-                <w:rStyle w:val="Enlla"/>
-                <w:noProof/>
-                <w:lang w:val="ca-ES"/>
-              </w:rPr>
-              <w:t>ui pot crear puntuacions</w:t>
+              <w:t>8.6 Qui pot crear puntuacions</w:t>
             </w:r>
             <w:r>
               <w:rPr>
@@ -9870,23 +10015,7 @@
                 <w:noProof/>
                 <w:lang w:val="ca-ES"/>
               </w:rPr>
-              <w:t>Con</w:t>
-            </w:r>
-            <w:r>
-              <w:rPr>
-                <w:rStyle w:val="Enlla"/>
-                <w:noProof/>
-                <w:lang w:val="ca-ES"/>
-              </w:rPr>
-              <w:t>c</w:t>
-            </w:r>
-            <w:r>
-              <w:rPr>
-                <w:rStyle w:val="Enlla"/>
-                <w:noProof/>
-                <w:lang w:val="ca-ES"/>
-              </w:rPr>
-              <w:t>lusió</w:t>
+              <w:t>Conclusió</w:t>
             </w:r>
             <w:r>
               <w:rPr>
@@ -10020,6 +10149,7 @@
         </w:rPr>
         <w:t>utilitzar el backend del projecte </w:t>
       </w:r>
+      <w:proofErr w:type="spellStart"/>
       <w:r>
         <w:rPr>
           <w:b/>
@@ -10030,6 +10160,7 @@
         </w:rPr>
         <w:t>KarmaWEBAPI</w:t>
       </w:r>
+      <w:proofErr w:type="spellEnd"/>
       <w:r>
         <w:rPr>
           <w:lang w:val="ca-ES"/>
@@ -10049,6 +10180,7 @@
         </w:rPr>
         <w:t xml:space="preserve">El projecte </w:t>
       </w:r>
+      <w:proofErr w:type="spellStart"/>
       <w:r>
         <w:rPr>
           <w:i/>
@@ -10057,6 +10189,7 @@
         </w:rPr>
         <w:t>KarmaWEBAPI</w:t>
       </w:r>
+      <w:proofErr w:type="spellEnd"/>
       <w:r>
         <w:rPr>
           <w:lang w:val="ca-ES"/>
@@ -10251,7 +10384,35 @@
         <w:rPr>
           <w:lang w:val="ca-ES"/>
         </w:rPr>
-        <w:t>No entra en detalls de Entity Framework, base de dades o patrons de disseny.</w:t>
+        <w:t xml:space="preserve">No entra en detalls de </w:t>
+      </w:r>
+      <w:proofErr w:type="spellStart"/>
+      <w:r>
+        <w:rPr>
+          <w:lang w:val="ca-ES"/>
+        </w:rPr>
+        <w:t>Entity</w:t>
+      </w:r>
+      <w:proofErr w:type="spellEnd"/>
+      <w:r>
+        <w:rPr>
+          <w:lang w:val="ca-ES"/>
+        </w:rPr>
+        <w:t xml:space="preserve"> </w:t>
+      </w:r>
+      <w:proofErr w:type="spellStart"/>
+      <w:r>
+        <w:rPr>
+          <w:lang w:val="ca-ES"/>
+        </w:rPr>
+        <w:t>Framework</w:t>
+      </w:r>
+      <w:proofErr w:type="spellEnd"/>
+      <w:r>
+        <w:rPr>
+          <w:lang w:val="ca-ES"/>
+        </w:rPr>
+        <w:t>, base de dades o patrons de disseny.</w:t>
       </w:r>
     </w:p>
     <w:p>
@@ -10401,6 +10562,7 @@
         </w:rPr>
         <w:t xml:space="preserve">comprendre què permet fer </w:t>
       </w:r>
+      <w:proofErr w:type="spellStart"/>
       <w:r>
         <w:rPr>
           <w:i/>
@@ -10409,6 +10571,7 @@
         </w:rPr>
         <w:t>KarmaWEBAPI</w:t>
       </w:r>
+      <w:proofErr w:type="spellEnd"/>
       <w:r>
         <w:rPr>
           <w:lang w:val="ca-ES"/>
@@ -10475,6 +10638,7 @@
         </w:rPr>
         <w:t xml:space="preserve">El sistema </w:t>
       </w:r>
+      <w:proofErr w:type="spellStart"/>
       <w:r>
         <w:rPr>
           <w:b/>
@@ -10483,6 +10647,7 @@
         </w:rPr>
         <w:t>KarmaWEBAPI</w:t>
       </w:r>
+      <w:proofErr w:type="spellEnd"/>
       <w:r>
         <w:rPr>
           <w:lang w:val="ca-ES"/>
@@ -10516,13 +10681,23 @@
         </w:rPr>
         <w:t xml:space="preserve">A diferència d’altres sistemes que només permeten consumir dades ja existents, </w:t>
       </w:r>
+      <w:proofErr w:type="spellStart"/>
       <w:r>
         <w:rPr>
           <w:b/>
           <w:bCs/>
           <w:lang w:val="ca-ES"/>
         </w:rPr>
-        <w:t>KarmaWEBAPI permet crear tota la informació necessària des de zero</w:t>
+        <w:t>KarmaWEBAPI</w:t>
+      </w:r>
+      <w:proofErr w:type="spellEnd"/>
+      <w:r>
+        <w:rPr>
+          <w:b/>
+          <w:bCs/>
+          <w:lang w:val="ca-ES"/>
+        </w:rPr>
+        <w:t xml:space="preserve"> permet crear tota la informació necessària des de zero</w:t>
       </w:r>
       <w:r>
         <w:rPr>
@@ -10723,6 +10898,7 @@
         </w:rPr>
         <w:t xml:space="preserve">Un aspecte clau de </w:t>
       </w:r>
+      <w:proofErr w:type="spellStart"/>
       <w:r>
         <w:rPr>
           <w:b/>
@@ -10731,6 +10907,7 @@
         </w:rPr>
         <w:t>KarmaWEBAPI</w:t>
       </w:r>
+      <w:proofErr w:type="spellEnd"/>
       <w:r>
         <w:rPr>
           <w:lang w:val="ca-ES"/>
@@ -10997,134 +11174,86 @@
         </w:rPr>
         <w:t xml:space="preserve">Aquesta visió global és important per a entendre que </w:t>
       </w:r>
+      <w:proofErr w:type="spellStart"/>
       <w:r>
         <w:rPr>
           <w:b/>
           <w:bCs/>
           <w:lang w:val="ca-ES"/>
         </w:rPr>
-        <w:t>KarmaWEBAPI no és un conjunt d’endpoints independents</w:t>
-      </w:r>
-      <w:r>
-        <w:rPr>
-          <w:lang w:val="ca-ES"/>
-        </w:rPr>
-        <w:t>, sinó un sistema cohesionat, on cada element té sentit en relació amb els altres.</w:t>
-      </w:r>
-    </w:p>
-    <w:p>
-      <w:pPr>
-        <w:pStyle w:val="Ttol1"/>
-      </w:pPr>
-      <w:bookmarkStart w:id="2" w:name="_Toc229240560"/>
-      <w:r>
-        <w:t>Perfils d’usuari i control d’accés</w:t>
-      </w:r>
-      <w:bookmarkEnd w:id="2"/>
-    </w:p>
-    <w:p>
-      <w:pPr>
-        <w:rPr>
-          <w:lang w:val="ca-ES"/>
-        </w:rPr>
-      </w:pPr>
-      <w:r>
-        <w:rPr>
-          <w:lang w:val="ca-ES"/>
-        </w:rPr>
-        <w:t xml:space="preserve">El sistema </w:t>
-      </w:r>
+        <w:t>KarmaWEBAPI</w:t>
+      </w:r>
+      <w:proofErr w:type="spellEnd"/>
       <w:r>
         <w:rPr>
           <w:b/>
           <w:bCs/>
           <w:lang w:val="ca-ES"/>
         </w:rPr>
-        <w:t>KarmaWEBAPI</w:t>
-      </w:r>
-      <w:r>
-        <w:rPr>
-          <w:lang w:val="ca-ES"/>
-        </w:rPr>
-        <w:t xml:space="preserve"> incorpora un </w:t>
-      </w:r>
+        <w:t xml:space="preserve"> no és un conjunt </w:t>
+      </w:r>
+      <w:proofErr w:type="spellStart"/>
       <w:r>
         <w:rPr>
           <w:b/>
           <w:bCs/>
           <w:lang w:val="ca-ES"/>
         </w:rPr>
-        <w:t>model de control d’accés basat en rols</w:t>
-      </w:r>
-      <w:r>
-        <w:rPr>
-          <w:lang w:val="ca-ES"/>
-        </w:rPr>
-        <w:t xml:space="preserve">, que determina </w:t>
-      </w:r>
+        <w:t>d’endpoints</w:t>
+      </w:r>
+      <w:proofErr w:type="spellEnd"/>
       <w:r>
         <w:rPr>
           <w:b/>
           <w:bCs/>
           <w:lang w:val="ca-ES"/>
         </w:rPr>
-        <w:t>què pot fer cada persona usuària</w:t>
-      </w:r>
-      <w:r>
-        <w:rPr>
-          <w:lang w:val="ca-ES"/>
-        </w:rPr>
-        <w:t xml:space="preserve"> dins del sistema. Aquesta diferenciació és fonamental per a garantir la seguretat, la coherència de les dades i un ús correcte de les funcionalitats disponibles.</w:t>
-      </w:r>
-    </w:p>
-    <w:p>
-      <w:pPr>
-        <w:rPr>
-          <w:lang w:val="ca-ES"/>
-        </w:rPr>
-      </w:pPr>
-      <w:r>
-        <w:rPr>
-          <w:lang w:val="ca-ES"/>
-        </w:rPr>
-        <w:t xml:space="preserve">Cada petició a l’API s’executa sota un </w:t>
-      </w:r>
+        <w:t xml:space="preserve"> independents</w:t>
+      </w:r>
+      <w:r>
+        <w:rPr>
+          <w:lang w:val="ca-ES"/>
+        </w:rPr>
+        <w:t>, sinó un sistema cohesionat, on cada element té sentit en relació amb els altres.</w:t>
+      </w:r>
+    </w:p>
+    <w:p>
+      <w:pPr>
+        <w:pStyle w:val="Ttol1"/>
+      </w:pPr>
+      <w:bookmarkStart w:id="2" w:name="_Toc229240560"/>
+      <w:r>
+        <w:t>Perfils d’usuari i control d’accés</w:t>
+      </w:r>
+      <w:bookmarkEnd w:id="2"/>
+    </w:p>
+    <w:p>
+      <w:pPr>
+        <w:rPr>
+          <w:lang w:val="ca-ES"/>
+        </w:rPr>
+      </w:pPr>
+      <w:r>
+        <w:rPr>
+          <w:lang w:val="ca-ES"/>
+        </w:rPr>
+        <w:t xml:space="preserve">El sistema </w:t>
+      </w:r>
+      <w:proofErr w:type="spellStart"/>
       <w:r>
         <w:rPr>
           <w:b/>
           <w:bCs/>
           <w:lang w:val="ca-ES"/>
         </w:rPr>
-        <w:t>perfil d’usuari concret</w:t>
-      </w:r>
-      <w:r>
-        <w:rPr>
-          <w:lang w:val="ca-ES"/>
-        </w:rPr>
-        <w:t>, i el sistema valida automàticament si aquest perfil té permís per a realitzar l’acció sol·licitada.</w:t>
-      </w:r>
-    </w:p>
-    <w:p>
-      <w:pPr>
-        <w:pStyle w:val="Ttol2"/>
-      </w:pPr>
-      <w:bookmarkStart w:id="3" w:name="_Toc229240561"/>
-      <w:r>
-        <w:t>Rols existents en el sistema</w:t>
-      </w:r>
-      <w:bookmarkEnd w:id="3"/>
-    </w:p>
-    <w:p>
-      <w:pPr>
-        <w:rPr>
-          <w:lang w:val="ca-ES"/>
-        </w:rPr>
-      </w:pPr>
-      <w:r>
-        <w:rPr>
-          <w:lang w:val="ca-ES"/>
-        </w:rPr>
-        <w:t xml:space="preserve">En </w:t>
+        <w:t>KarmaWEBAPI</w:t>
+      </w:r>
+      <w:proofErr w:type="spellEnd"/>
+      <w:r>
+        <w:rPr>
+          <w:lang w:val="ca-ES"/>
+        </w:rPr>
+        <w:t xml:space="preserve"> incorpora un </w:t>
       </w:r>
       <w:r>
         <w:rPr>
@@ -11132,8 +11261,88 @@
           <w:bCs/>
           <w:lang w:val="ca-ES"/>
         </w:rPr>
+        <w:t>model de control d’accés basat en rols</w:t>
+      </w:r>
+      <w:r>
+        <w:rPr>
+          <w:lang w:val="ca-ES"/>
+        </w:rPr>
+        <w:t xml:space="preserve">, que determina </w:t>
+      </w:r>
+      <w:r>
+        <w:rPr>
+          <w:b/>
+          <w:bCs/>
+          <w:lang w:val="ca-ES"/>
+        </w:rPr>
+        <w:t>què pot fer cada persona usuària</w:t>
+      </w:r>
+      <w:r>
+        <w:rPr>
+          <w:lang w:val="ca-ES"/>
+        </w:rPr>
+        <w:t xml:space="preserve"> dins del sistema. Aquesta diferenciació és fonamental per a garantir la seguretat, la coherència de les dades i un ús correcte de les funcionalitats disponibles.</w:t>
+      </w:r>
+    </w:p>
+    <w:p>
+      <w:pPr>
+        <w:rPr>
+          <w:lang w:val="ca-ES"/>
+        </w:rPr>
+      </w:pPr>
+      <w:r>
+        <w:rPr>
+          <w:lang w:val="ca-ES"/>
+        </w:rPr>
+        <w:t xml:space="preserve">Cada petició a l’API s’executa sota un </w:t>
+      </w:r>
+      <w:r>
+        <w:rPr>
+          <w:b/>
+          <w:bCs/>
+          <w:lang w:val="ca-ES"/>
+        </w:rPr>
+        <w:t>perfil d’usuari concret</w:t>
+      </w:r>
+      <w:r>
+        <w:rPr>
+          <w:lang w:val="ca-ES"/>
+        </w:rPr>
+        <w:t>, i el sistema valida automàticament si aquest perfil té permís per a realitzar l’acció sol·licitada.</w:t>
+      </w:r>
+    </w:p>
+    <w:p>
+      <w:pPr>
+        <w:pStyle w:val="Ttol2"/>
+      </w:pPr>
+      <w:bookmarkStart w:id="3" w:name="_Toc229240561"/>
+      <w:r>
+        <w:t>Rols existents en el sistema</w:t>
+      </w:r>
+      <w:bookmarkEnd w:id="3"/>
+    </w:p>
+    <w:p>
+      <w:pPr>
+        <w:rPr>
+          <w:lang w:val="ca-ES"/>
+        </w:rPr>
+      </w:pPr>
+      <w:r>
+        <w:rPr>
+          <w:lang w:val="ca-ES"/>
+        </w:rPr>
+        <w:t xml:space="preserve">En </w:t>
+      </w:r>
+      <w:proofErr w:type="spellStart"/>
+      <w:r>
+        <w:rPr>
+          <w:b/>
+          <w:bCs/>
+          <w:lang w:val="ca-ES"/>
+        </w:rPr>
         <w:t>KarmaWEBAPI</w:t>
       </w:r>
+      <w:proofErr w:type="spellEnd"/>
       <w:r>
         <w:rPr>
           <w:lang w:val="ca-ES"/>
@@ -11900,7 +12109,21 @@
         <w:rPr>
           <w:lang w:val="ca-ES"/>
         </w:rPr>
-        <w:t>reiniciar el karma quan estiga permés,</w:t>
+        <w:t xml:space="preserve">reiniciar el karma quan estiga </w:t>
+      </w:r>
+      <w:proofErr w:type="spellStart"/>
+      <w:r>
+        <w:rPr>
+          <w:lang w:val="ca-ES"/>
+        </w:rPr>
+        <w:t>permés</w:t>
+      </w:r>
+      <w:proofErr w:type="spellEnd"/>
+      <w:r>
+        <w:rPr>
+          <w:lang w:val="ca-ES"/>
+        </w:rPr>
+        <w:t>,</w:t>
       </w:r>
     </w:p>
     <w:p>
@@ -12103,6 +12326,7 @@
         </w:rPr>
         <w:t xml:space="preserve">Un aspecte fonamental per a utilitzar correctament </w:t>
       </w:r>
+      <w:proofErr w:type="spellStart"/>
       <w:r>
         <w:rPr>
           <w:b/>
@@ -12111,6 +12335,7 @@
         </w:rPr>
         <w:t>KarmaWEBAPI</w:t>
       </w:r>
+      <w:proofErr w:type="spellEnd"/>
       <w:r>
         <w:rPr>
           <w:lang w:val="ca-ES"/>
@@ -12345,7 +12570,21 @@
           <w:lang w:val="ca-ES"/>
         </w:rPr>
         <w:br/>
-        <w:t>Tota la informació del sistema depén d’un any escolar concret.</w:t>
+        <w:t xml:space="preserve">Tota la informació del sistema </w:t>
+      </w:r>
+      <w:proofErr w:type="spellStart"/>
+      <w:r>
+        <w:rPr>
+          <w:lang w:val="ca-ES"/>
+        </w:rPr>
+        <w:t>depén</w:t>
+      </w:r>
+      <w:proofErr w:type="spellEnd"/>
+      <w:r>
+        <w:rPr>
+          <w:lang w:val="ca-ES"/>
+        </w:rPr>
+        <w:t xml:space="preserve"> d’un any escolar concret.</w:t>
       </w:r>
     </w:p>
     <w:p>
@@ -13190,8 +13429,18 @@
           <w:bCs/>
           <w:lang w:val="ca-ES"/>
         </w:rPr>
-        <w:t>base de tot el sistema KarmaWEBAPI</w:t>
-      </w:r>
+        <w:t xml:space="preserve">base de tot el sistema </w:t>
+      </w:r>
+      <w:proofErr w:type="spellStart"/>
+      <w:r>
+        <w:rPr>
+          <w:b/>
+          <w:bCs/>
+          <w:lang w:val="ca-ES"/>
+        </w:rPr>
+        <w:t>KarmaWEBAPI</w:t>
+      </w:r>
+      <w:proofErr w:type="spellEnd"/>
       <w:r>
         <w:rPr>
           <w:lang w:val="ca-ES"/>
@@ -13684,6 +13933,7 @@
         </w:rPr>
         <w:t xml:space="preserve">En </w:t>
       </w:r>
+      <w:proofErr w:type="spellStart"/>
       <w:r>
         <w:rPr>
           <w:b/>
@@ -13692,6 +13942,7 @@
         </w:rPr>
         <w:t>KarmaWEBAPI</w:t>
       </w:r>
+      <w:proofErr w:type="spellEnd"/>
       <w:r>
         <w:rPr>
           <w:lang w:val="ca-ES"/>
@@ -13962,7 +14213,21 @@
         <w:rPr>
           <w:lang w:val="ca-ES"/>
         </w:rPr>
-        <w:t>GET /api/classe/llista?idAnyEscolar=1</w:t>
+        <w:t>GET /api/classe/</w:t>
+      </w:r>
+      <w:proofErr w:type="spellStart"/>
+      <w:r>
+        <w:rPr>
+          <w:lang w:val="ca-ES"/>
+        </w:rPr>
+        <w:t>llista?idAnyEscolar</w:t>
+      </w:r>
+      <w:proofErr w:type="spellEnd"/>
+      <w:r>
+        <w:rPr>
+          <w:lang w:val="ca-ES"/>
+        </w:rPr>
+        <w:t>=1</w:t>
       </w:r>
     </w:p>
     <w:p>
@@ -14404,7 +14669,21 @@
         <w:rPr>
           <w:lang w:val="ca-ES"/>
         </w:rPr>
-        <w:t>GET /api/grup/llista?idClasse=1&amp;idAnyEscolar=1</w:t>
+        <w:t>GET /api/grup/</w:t>
+      </w:r>
+      <w:proofErr w:type="spellStart"/>
+      <w:r>
+        <w:rPr>
+          <w:lang w:val="ca-ES"/>
+        </w:rPr>
+        <w:t>llista?idClasse</w:t>
+      </w:r>
+      <w:proofErr w:type="spellEnd"/>
+      <w:r>
+        <w:rPr>
+          <w:lang w:val="ca-ES"/>
+        </w:rPr>
+        <w:t>=1&amp;idAnyEscolar=1</w:t>
       </w:r>
     </w:p>
     <w:p>
@@ -14755,100 +15034,54 @@
           <w:bCs/>
           <w:lang w:val="ca-ES"/>
         </w:rPr>
-        <w:t>tota pràctica amb KarmaWEBAPI ha de començar sempre assegurant que aquesta estructura està ben definida</w:t>
-      </w:r>
-      <w:r>
-        <w:rPr>
-          <w:lang w:val="ca-ES"/>
-        </w:rPr>
-        <w:t>.</w:t>
-      </w:r>
-    </w:p>
-    <w:p>
-      <w:pPr>
-        <w:pStyle w:val="Ttol1"/>
-      </w:pPr>
-      <w:bookmarkStart w:id="20" w:name="_Toc229240578"/>
-      <w:r>
-        <w:t>Gestió de l’alumnat</w:t>
-      </w:r>
-      <w:bookmarkEnd w:id="20"/>
-    </w:p>
-    <w:p>
-      <w:pPr>
-        <w:rPr>
-          <w:lang w:val="ca-ES"/>
-        </w:rPr>
-      </w:pPr>
-      <w:r>
-        <w:rPr>
-          <w:lang w:val="ca-ES"/>
-        </w:rPr>
-        <w:t>L’</w:t>
-      </w:r>
+        <w:t xml:space="preserve">tota pràctica amb </w:t>
+      </w:r>
+      <w:proofErr w:type="spellStart"/>
       <w:r>
         <w:rPr>
           <w:b/>
           <w:bCs/>
           <w:lang w:val="ca-ES"/>
         </w:rPr>
-        <w:t>alumnat</w:t>
-      </w:r>
-      <w:r>
-        <w:rPr>
-          <w:lang w:val="ca-ES"/>
-        </w:rPr>
-        <w:t xml:space="preserve"> és l’element central del sistema </w:t>
-      </w:r>
+        <w:t>KarmaWEBAPI</w:t>
+      </w:r>
+      <w:proofErr w:type="spellEnd"/>
       <w:r>
         <w:rPr>
           <w:b/>
           <w:bCs/>
           <w:lang w:val="ca-ES"/>
         </w:rPr>
-        <w:t>KarmaWEBAPI</w:t>
-      </w:r>
-      <w:r>
-        <w:rPr>
-          <w:lang w:val="ca-ES"/>
-        </w:rPr>
-        <w:t>, ja que totes les puntuacions, el karma i els privilegis es calculen a partir de les accions realitzades sobre els alumnes.</w:t>
-      </w:r>
-    </w:p>
-    <w:p>
-      <w:pPr>
-        <w:rPr>
-          <w:lang w:val="ca-ES"/>
-        </w:rPr>
-      </w:pPr>
-      <w:r>
-        <w:rPr>
-          <w:lang w:val="ca-ES"/>
-        </w:rPr>
-        <w:t>Un alumne representa una persona concreta matriculada dins d’un any escolar, associada a una classe i, opcionalment, a un grup. Tot el comportament del sistema, des del càlcul del karma fins a la consulta d’historials, gira al voltant d’aquesta entitat.</w:t>
-      </w:r>
-    </w:p>
-    <w:p>
-      <w:pPr>
-        <w:pStyle w:val="Ttol2"/>
-      </w:pPr>
-      <w:bookmarkStart w:id="21" w:name="_Toc229240579"/>
-      <w:r>
-        <w:t>Què és un alumne dins del sistema</w:t>
-      </w:r>
-      <w:bookmarkEnd w:id="21"/>
-    </w:p>
-    <w:p>
-      <w:pPr>
-        <w:rPr>
-          <w:lang w:val="ca-ES"/>
-        </w:rPr>
-      </w:pPr>
-      <w:r>
-        <w:rPr>
-          <w:lang w:val="ca-ES"/>
-        </w:rPr>
-        <w:t xml:space="preserve">En </w:t>
+        <w:t xml:space="preserve"> ha de començar sempre assegurant que aquesta estructura està ben definida</w:t>
+      </w:r>
+      <w:r>
+        <w:rPr>
+          <w:lang w:val="ca-ES"/>
+        </w:rPr>
+        <w:t>.</w:t>
+      </w:r>
+    </w:p>
+    <w:p>
+      <w:pPr>
+        <w:pStyle w:val="Ttol1"/>
+      </w:pPr>
+      <w:bookmarkStart w:id="20" w:name="_Toc229240578"/>
+      <w:r>
+        <w:t>Gestió de l’alumnat</w:t>
+      </w:r>
+      <w:bookmarkEnd w:id="20"/>
+    </w:p>
+    <w:p>
+      <w:pPr>
+        <w:rPr>
+          <w:lang w:val="ca-ES"/>
+        </w:rPr>
+      </w:pPr>
+      <w:r>
+        <w:rPr>
+          <w:lang w:val="ca-ES"/>
+        </w:rPr>
+        <w:t>L’</w:t>
       </w:r>
       <w:r>
         <w:rPr>
@@ -14856,8 +15089,76 @@
           <w:bCs/>
           <w:lang w:val="ca-ES"/>
         </w:rPr>
+        <w:t>alumnat</w:t>
+      </w:r>
+      <w:r>
+        <w:rPr>
+          <w:lang w:val="ca-ES"/>
+        </w:rPr>
+        <w:t xml:space="preserve"> és l’element central del sistema </w:t>
+      </w:r>
+      <w:proofErr w:type="spellStart"/>
+      <w:r>
+        <w:rPr>
+          <w:b/>
+          <w:bCs/>
+          <w:lang w:val="ca-ES"/>
+        </w:rPr>
         <w:t>KarmaWEBAPI</w:t>
       </w:r>
+      <w:proofErr w:type="spellEnd"/>
+      <w:r>
+        <w:rPr>
+          <w:lang w:val="ca-ES"/>
+        </w:rPr>
+        <w:t>, ja que totes les puntuacions, el karma i els privilegis es calculen a partir de les accions realitzades sobre els alumnes.</w:t>
+      </w:r>
+    </w:p>
+    <w:p>
+      <w:pPr>
+        <w:rPr>
+          <w:lang w:val="ca-ES"/>
+        </w:rPr>
+      </w:pPr>
+      <w:r>
+        <w:rPr>
+          <w:lang w:val="ca-ES"/>
+        </w:rPr>
+        <w:t>Un alumne representa una persona concreta matriculada dins d’un any escolar, associada a una classe i, opcionalment, a un grup. Tot el comportament del sistema, des del càlcul del karma fins a la consulta d’historials, gira al voltant d’aquesta entitat.</w:t>
+      </w:r>
+    </w:p>
+    <w:p>
+      <w:pPr>
+        <w:pStyle w:val="Ttol2"/>
+      </w:pPr>
+      <w:bookmarkStart w:id="21" w:name="_Toc229240579"/>
+      <w:r>
+        <w:t>Què és un alumne dins del sistema</w:t>
+      </w:r>
+      <w:bookmarkEnd w:id="21"/>
+    </w:p>
+    <w:p>
+      <w:pPr>
+        <w:rPr>
+          <w:lang w:val="ca-ES"/>
+        </w:rPr>
+      </w:pPr>
+      <w:r>
+        <w:rPr>
+          <w:lang w:val="ca-ES"/>
+        </w:rPr>
+        <w:t xml:space="preserve">En </w:t>
+      </w:r>
+      <w:proofErr w:type="spellStart"/>
+      <w:r>
+        <w:rPr>
+          <w:b/>
+          <w:bCs/>
+          <w:lang w:val="ca-ES"/>
+        </w:rPr>
+        <w:t>KarmaWEBAPI</w:t>
+      </w:r>
+      <w:proofErr w:type="spellEnd"/>
       <w:r>
         <w:rPr>
           <w:lang w:val="ca-ES"/>
@@ -15698,7 +15999,35 @@
           <w:lang w:val="ca-ES"/>
         </w:rPr>
         <w:lastRenderedPageBreak/>
-        <w:t>GET /api/puntuacio/per-alumne/{nia}?idAvaluacio=1</w:t>
+        <w:t>GET /api/</w:t>
+      </w:r>
+      <w:proofErr w:type="spellStart"/>
+      <w:r>
+        <w:rPr>
+          <w:lang w:val="ca-ES"/>
+        </w:rPr>
+        <w:t>puntuacio</w:t>
+      </w:r>
+      <w:proofErr w:type="spellEnd"/>
+      <w:r>
+        <w:rPr>
+          <w:lang w:val="ca-ES"/>
+        </w:rPr>
+        <w:t>/per-alumne/{nia}?</w:t>
+      </w:r>
+      <w:proofErr w:type="spellStart"/>
+      <w:r>
+        <w:rPr>
+          <w:lang w:val="ca-ES"/>
+        </w:rPr>
+        <w:t>idAvaluacio</w:t>
+      </w:r>
+      <w:proofErr w:type="spellEnd"/>
+      <w:r>
+        <w:rPr>
+          <w:lang w:val="ca-ES"/>
+        </w:rPr>
+        <w:t>=1</w:t>
       </w:r>
     </w:p>
     <w:p>
@@ -16093,11 +16422,19 @@
           <w:lang w:val="ca-ES"/>
         </w:rPr>
       </w:pPr>
-      <w:r>
-        <w:rPr>
-          <w:lang w:val="ca-ES"/>
-        </w:rPr>
-        <w:t>auditable,</w:t>
+      <w:proofErr w:type="spellStart"/>
+      <w:r>
+        <w:rPr>
+          <w:lang w:val="ca-ES"/>
+        </w:rPr>
+        <w:t>auditable</w:t>
+      </w:r>
+      <w:proofErr w:type="spellEnd"/>
+      <w:r>
+        <w:rPr>
+          <w:lang w:val="ca-ES"/>
+        </w:rPr>
+        <w:t>,</w:t>
       </w:r>
     </w:p>
     <w:p>
@@ -16168,6 +16505,7 @@
         </w:rPr>
         <w:t xml:space="preserve"> a l’alumnat dins del sistema </w:t>
       </w:r>
+      <w:proofErr w:type="spellStart"/>
       <w:r>
         <w:rPr>
           <w:b/>
@@ -16176,6 +16514,7 @@
         </w:rPr>
         <w:t>KarmaWEBAPI</w:t>
       </w:r>
+      <w:proofErr w:type="spellEnd"/>
       <w:r>
         <w:rPr>
           <w:lang w:val="ca-ES"/>
@@ -16852,7 +17191,21 @@
         <w:rPr>
           <w:lang w:val="ca-ES"/>
         </w:rPr>
-        <w:t>, encara que l’usuari el veja en pantalla,</w:t>
+        <w:t xml:space="preserve">, encara que l’usuari el </w:t>
+      </w:r>
+      <w:proofErr w:type="spellStart"/>
+      <w:r>
+        <w:rPr>
+          <w:lang w:val="ca-ES"/>
+        </w:rPr>
+        <w:t>veja</w:t>
+      </w:r>
+      <w:proofErr w:type="spellEnd"/>
+      <w:r>
+        <w:rPr>
+          <w:lang w:val="ca-ES"/>
+        </w:rPr>
+        <w:t xml:space="preserve"> en pantalla,</w:t>
       </w:r>
     </w:p>
     <w:p>
@@ -16978,7 +17331,21 @@
         <w:rPr>
           <w:lang w:val="ca-ES"/>
         </w:rPr>
-        <w:t>encara que un usuari intente forçar un valor diferent, el sistema el validarà automàticament.</w:t>
+        <w:t xml:space="preserve">encara que un usuari </w:t>
+      </w:r>
+      <w:proofErr w:type="spellStart"/>
+      <w:r>
+        <w:rPr>
+          <w:lang w:val="ca-ES"/>
+        </w:rPr>
+        <w:t>intente</w:t>
+      </w:r>
+      <w:proofErr w:type="spellEnd"/>
+      <w:r>
+        <w:rPr>
+          <w:lang w:val="ca-ES"/>
+        </w:rPr>
+        <w:t xml:space="preserve"> forçar un valor diferent, el sistema el validarà automàticament.</w:t>
       </w:r>
     </w:p>
     <w:p>
@@ -17743,6 +18110,7 @@
         </w:rPr>
         <w:t xml:space="preserve">Per aquest motiu, totes les pràctiques amb </w:t>
       </w:r>
+      <w:proofErr w:type="spellStart"/>
       <w:r>
         <w:rPr>
           <w:b/>
@@ -17751,6 +18119,7 @@
         </w:rPr>
         <w:t>KarmaWEBAPI</w:t>
       </w:r>
+      <w:proofErr w:type="spellEnd"/>
       <w:r>
         <w:rPr>
           <w:lang w:val="ca-ES"/>
@@ -17794,6 +18163,7 @@
         </w:rPr>
         <w:t xml:space="preserve"> és l’element central de </w:t>
       </w:r>
+      <w:proofErr w:type="spellStart"/>
       <w:r>
         <w:rPr>
           <w:b/>
@@ -17802,6 +18172,7 @@
         </w:rPr>
         <w:t>KarmaWEBAPI</w:t>
       </w:r>
+      <w:proofErr w:type="spellEnd"/>
       <w:r>
         <w:rPr>
           <w:lang w:val="ca-ES"/>
@@ -17835,6 +18206,7 @@
         </w:rPr>
         <w:t xml:space="preserve">En </w:t>
       </w:r>
+      <w:proofErr w:type="spellStart"/>
       <w:r>
         <w:rPr>
           <w:b/>
@@ -17843,6 +18215,7 @@
         </w:rPr>
         <w:t>KarmaWEBAPI</w:t>
       </w:r>
+      <w:proofErr w:type="spellEnd"/>
       <w:r>
         <w:rPr>
           <w:lang w:val="ca-ES"/>
@@ -19244,7 +19617,21 @@
         <w:rPr>
           <w:lang w:val="ca-ES"/>
         </w:rPr>
-        <w:t>pot crear puntuacions de reinici quan està permés,</w:t>
+        <w:t xml:space="preserve">pot crear puntuacions de reinici quan està </w:t>
+      </w:r>
+      <w:proofErr w:type="spellStart"/>
+      <w:r>
+        <w:rPr>
+          <w:lang w:val="ca-ES"/>
+        </w:rPr>
+        <w:t>permés</w:t>
+      </w:r>
+      <w:proofErr w:type="spellEnd"/>
+      <w:r>
+        <w:rPr>
+          <w:lang w:val="ca-ES"/>
+        </w:rPr>
+        <w:t>,</w:t>
       </w:r>
     </w:p>
     <w:p>
@@ -19450,7 +19837,21 @@
         <w:rPr>
           <w:lang w:val="ca-ES"/>
         </w:rPr>
-        <w:t>POST /api/puntuacio/assignar-punts</w:t>
+        <w:t>POST /api/</w:t>
+      </w:r>
+      <w:proofErr w:type="spellStart"/>
+      <w:r>
+        <w:rPr>
+          <w:lang w:val="ca-ES"/>
+        </w:rPr>
+        <w:t>puntuacio</w:t>
+      </w:r>
+      <w:proofErr w:type="spellEnd"/>
+      <w:r>
+        <w:rPr>
+          <w:lang w:val="ca-ES"/>
+        </w:rPr>
+        <w:t>/assignar-punts</w:t>
       </w:r>
     </w:p>
     <w:p>
@@ -19477,7 +19878,21 @@
         <w:rPr>
           <w:lang w:val="ca-ES"/>
         </w:rPr>
-        <w:t>POST /api/puntuacio/reiniciar-punts</w:t>
+        <w:t>POST /api/</w:t>
+      </w:r>
+      <w:proofErr w:type="spellStart"/>
+      <w:r>
+        <w:rPr>
+          <w:lang w:val="ca-ES"/>
+        </w:rPr>
+        <w:t>puntuacio</w:t>
+      </w:r>
+      <w:proofErr w:type="spellEnd"/>
+      <w:r>
+        <w:rPr>
+          <w:lang w:val="ca-ES"/>
+        </w:rPr>
+        <w:t>/reiniciar-punts</w:t>
       </w:r>
     </w:p>
     <w:p>
@@ -19504,7 +19919,35 @@
         <w:rPr>
           <w:lang w:val="ca-ES"/>
         </w:rPr>
-        <w:t>GET /api/puntuacio/per-alumne/{nia}?idAvaluacio=1</w:t>
+        <w:t>GET /api/</w:t>
+      </w:r>
+      <w:proofErr w:type="spellStart"/>
+      <w:r>
+        <w:rPr>
+          <w:lang w:val="ca-ES"/>
+        </w:rPr>
+        <w:t>puntuacio</w:t>
+      </w:r>
+      <w:proofErr w:type="spellEnd"/>
+      <w:r>
+        <w:rPr>
+          <w:lang w:val="ca-ES"/>
+        </w:rPr>
+        <w:t>/per-alumne/{nia}?</w:t>
+      </w:r>
+      <w:proofErr w:type="spellStart"/>
+      <w:r>
+        <w:rPr>
+          <w:lang w:val="ca-ES"/>
+        </w:rPr>
+        <w:t>idAvaluacio</w:t>
+      </w:r>
+      <w:proofErr w:type="spellEnd"/>
+      <w:r>
+        <w:rPr>
+          <w:lang w:val="ca-ES"/>
+        </w:rPr>
+        <w:t>=1</w:t>
       </w:r>
     </w:p>
     <w:p>
@@ -19610,6 +20053,7 @@
         </w:rPr>
         <w:t xml:space="preserve"> per a fer un ús correcte de </w:t>
       </w:r>
+      <w:proofErr w:type="spellStart"/>
       <w:r>
         <w:rPr>
           <w:b/>
@@ -19618,6 +20062,7 @@
         </w:rPr>
         <w:t>KarmaWEBAPI</w:t>
       </w:r>
+      <w:proofErr w:type="spellEnd"/>
       <w:r>
         <w:rPr>
           <w:lang w:val="ca-ES"/>
@@ -19662,6 +20107,7 @@
         </w:rPr>
         <w:t xml:space="preserve"> és el resultat final visible del sistema de puntuacions de </w:t>
       </w:r>
+      <w:proofErr w:type="spellStart"/>
       <w:r>
         <w:rPr>
           <w:b/>
@@ -19670,6 +20116,7 @@
         </w:rPr>
         <w:t>KarmaWEBAPI</w:t>
       </w:r>
+      <w:proofErr w:type="spellEnd"/>
       <w:r>
         <w:rPr>
           <w:lang w:val="ca-ES"/>
@@ -20125,6 +20572,7 @@
         </w:rPr>
         <w:t xml:space="preserve">A més del karma individual, </w:t>
       </w:r>
+      <w:proofErr w:type="spellStart"/>
       <w:r>
         <w:rPr>
           <w:b/>
@@ -20133,6 +20581,7 @@
         </w:rPr>
         <w:t>KarmaWEBAPI</w:t>
       </w:r>
+      <w:proofErr w:type="spellEnd"/>
       <w:r>
         <w:rPr>
           <w:lang w:val="ca-ES"/>
@@ -20268,7 +20717,21 @@
         <w:rPr>
           <w:lang w:val="ca-ES"/>
         </w:rPr>
-        <w:t>projectes col·laboratius,</w:t>
+        <w:t xml:space="preserve">projectes </w:t>
+      </w:r>
+      <w:proofErr w:type="spellStart"/>
+      <w:r>
+        <w:rPr>
+          <w:lang w:val="ca-ES"/>
+        </w:rPr>
+        <w:t>col·laboratius</w:t>
+      </w:r>
+      <w:proofErr w:type="spellEnd"/>
+      <w:r>
+        <w:rPr>
+          <w:lang w:val="ca-ES"/>
+        </w:rPr>
+        <w:t>,</w:t>
       </w:r>
     </w:p>
     <w:p>
@@ -20338,7 +20801,25 @@
           <w:bCs/>
           <w:lang w:val="ca-ES"/>
         </w:rPr>
-        <w:t>karma de grup depén del karma dels alumnes</w:t>
+        <w:t xml:space="preserve">karma de grup </w:t>
+      </w:r>
+      <w:proofErr w:type="spellStart"/>
+      <w:r>
+        <w:rPr>
+          <w:b/>
+          <w:bCs/>
+          <w:lang w:val="ca-ES"/>
+        </w:rPr>
+        <w:t>depén</w:t>
+      </w:r>
+      <w:proofErr w:type="spellEnd"/>
+      <w:r>
+        <w:rPr>
+          <w:b/>
+          <w:bCs/>
+          <w:lang w:val="ca-ES"/>
+        </w:rPr>
+        <w:t xml:space="preserve"> del karma dels alumnes</w:t>
       </w:r>
       <w:r>
         <w:rPr>
@@ -20429,7 +20910,21 @@
         <w:rPr>
           <w:lang w:val="ca-ES"/>
         </w:rPr>
-        <w:t>els alumnes entenguen que les seues accions afecten el grup,</w:t>
+        <w:t xml:space="preserve">els alumnes </w:t>
+      </w:r>
+      <w:proofErr w:type="spellStart"/>
+      <w:r>
+        <w:rPr>
+          <w:lang w:val="ca-ES"/>
+        </w:rPr>
+        <w:t>entenguen</w:t>
+      </w:r>
+      <w:proofErr w:type="spellEnd"/>
+      <w:r>
+        <w:rPr>
+          <w:lang w:val="ca-ES"/>
+        </w:rPr>
+        <w:t xml:space="preserve"> que les seues accions afecten el grup,</w:t>
       </w:r>
     </w:p>
     <w:p>
@@ -20447,7 +20942,21 @@
         <w:rPr>
           <w:lang w:val="ca-ES"/>
         </w:rPr>
-        <w:t>el sistema fomente la responsabilitat compartida.</w:t>
+        <w:t xml:space="preserve">el sistema </w:t>
+      </w:r>
+      <w:proofErr w:type="spellStart"/>
+      <w:r>
+        <w:rPr>
+          <w:lang w:val="ca-ES"/>
+        </w:rPr>
+        <w:t>fomente</w:t>
+      </w:r>
+      <w:proofErr w:type="spellEnd"/>
+      <w:r>
+        <w:rPr>
+          <w:lang w:val="ca-ES"/>
+        </w:rPr>
+        <w:t xml:space="preserve"> la responsabilitat compartida.</w:t>
       </w:r>
     </w:p>
     <w:p>
@@ -20708,7 +21217,35 @@
         <w:rPr>
           <w:lang w:val="ca-ES"/>
         </w:rPr>
-        <w:t>GET /api/puntuacio/per-alumne/{nia}?idAvaluacio=1</w:t>
+        <w:t>GET /api/</w:t>
+      </w:r>
+      <w:proofErr w:type="spellStart"/>
+      <w:r>
+        <w:rPr>
+          <w:lang w:val="ca-ES"/>
+        </w:rPr>
+        <w:t>puntuacio</w:t>
+      </w:r>
+      <w:proofErr w:type="spellEnd"/>
+      <w:r>
+        <w:rPr>
+          <w:lang w:val="ca-ES"/>
+        </w:rPr>
+        <w:t>/per-alumne/{nia}?</w:t>
+      </w:r>
+      <w:proofErr w:type="spellStart"/>
+      <w:r>
+        <w:rPr>
+          <w:lang w:val="ca-ES"/>
+        </w:rPr>
+        <w:t>idAvaluacio</w:t>
+      </w:r>
+      <w:proofErr w:type="spellEnd"/>
+      <w:r>
+        <w:rPr>
+          <w:lang w:val="ca-ES"/>
+        </w:rPr>
+        <w:t>=1</w:t>
       </w:r>
     </w:p>
     <w:p>
@@ -20868,6 +21405,7 @@
         </w:rPr>
         <w:t xml:space="preserve">En </w:t>
       </w:r>
+      <w:proofErr w:type="spellStart"/>
       <w:r>
         <w:rPr>
           <w:b/>
@@ -20876,6 +21414,7 @@
         </w:rPr>
         <w:t>KarmaWEBAPI</w:t>
       </w:r>
+      <w:proofErr w:type="spellEnd"/>
       <w:r>
         <w:rPr>
           <w:lang w:val="ca-ES"/>
@@ -20916,7 +21455,21 @@
         <w:rPr>
           <w:lang w:val="ca-ES"/>
         </w:rPr>
-        <w:t>és recalculable a partir de l’historial,</w:t>
+        <w:t xml:space="preserve">és </w:t>
+      </w:r>
+      <w:proofErr w:type="spellStart"/>
+      <w:r>
+        <w:rPr>
+          <w:lang w:val="ca-ES"/>
+        </w:rPr>
+        <w:t>recalculable</w:t>
+      </w:r>
+      <w:proofErr w:type="spellEnd"/>
+      <w:r>
+        <w:rPr>
+          <w:lang w:val="ca-ES"/>
+        </w:rPr>
+        <w:t xml:space="preserve"> a partir de l’historial,</w:t>
       </w:r>
     </w:p>
     <w:p>
@@ -21014,6 +21567,7 @@
         </w:rPr>
         <w:t xml:space="preserve"> dins del sistema </w:t>
       </w:r>
+      <w:proofErr w:type="spellStart"/>
       <w:r>
         <w:rPr>
           <w:b/>
@@ -21022,6 +21576,7 @@
         </w:rPr>
         <w:t>KarmaWEBAPI</w:t>
       </w:r>
+      <w:proofErr w:type="spellEnd"/>
       <w:r>
         <w:rPr>
           <w:lang w:val="ca-ES"/>
@@ -21207,11 +21762,19 @@
           <w:lang w:val="ca-ES"/>
         </w:rPr>
       </w:pPr>
-      <w:r>
-        <w:rPr>
-          <w:lang w:val="ca-ES"/>
-        </w:rPr>
-        <w:t>obtindre permisos especials,</w:t>
+      <w:proofErr w:type="spellStart"/>
+      <w:r>
+        <w:rPr>
+          <w:lang w:val="ca-ES"/>
+        </w:rPr>
+        <w:t>obtindre</w:t>
+      </w:r>
+      <w:proofErr w:type="spellEnd"/>
+      <w:r>
+        <w:rPr>
+          <w:lang w:val="ca-ES"/>
+        </w:rPr>
+        <w:t xml:space="preserve"> permisos especials,</w:t>
       </w:r>
     </w:p>
     <w:p>
@@ -21244,6 +21807,7 @@
         </w:rPr>
         <w:t xml:space="preserve">En </w:t>
       </w:r>
+      <w:proofErr w:type="spellStart"/>
       <w:r>
         <w:rPr>
           <w:b/>
@@ -21252,6 +21816,7 @@
         </w:rPr>
         <w:t>KarmaWEBAPI</w:t>
       </w:r>
+      <w:proofErr w:type="spellEnd"/>
       <w:r>
         <w:rPr>
           <w:lang w:val="ca-ES"/>
@@ -22176,11 +22741,19 @@
           <w:lang w:val="ca-ES"/>
         </w:rPr>
       </w:pPr>
-      <w:r>
-        <w:rPr>
-          <w:lang w:val="ca-ES"/>
-        </w:rPr>
-        <w:t>veja clarament què ha aconseguit,</w:t>
+      <w:proofErr w:type="spellStart"/>
+      <w:r>
+        <w:rPr>
+          <w:lang w:val="ca-ES"/>
+        </w:rPr>
+        <w:t>veja</w:t>
+      </w:r>
+      <w:proofErr w:type="spellEnd"/>
+      <w:r>
+        <w:rPr>
+          <w:lang w:val="ca-ES"/>
+        </w:rPr>
+        <w:t xml:space="preserve"> clarament què ha aconseguit,</w:t>
       </w:r>
     </w:p>
     <w:p>
@@ -22194,11 +22767,19 @@
           <w:lang w:val="ca-ES"/>
         </w:rPr>
       </w:pPr>
-      <w:r>
-        <w:rPr>
-          <w:lang w:val="ca-ES"/>
-        </w:rPr>
-        <w:t>relacione el privilegi amb el seu esforç,</w:t>
+      <w:proofErr w:type="spellStart"/>
+      <w:r>
+        <w:rPr>
+          <w:lang w:val="ca-ES"/>
+        </w:rPr>
+        <w:t>relacione</w:t>
+      </w:r>
+      <w:proofErr w:type="spellEnd"/>
+      <w:r>
+        <w:rPr>
+          <w:lang w:val="ca-ES"/>
+        </w:rPr>
+        <w:t xml:space="preserve"> el privilegi amb el seu esforç,</w:t>
       </w:r>
     </w:p>
     <w:p>
@@ -22253,7 +22834,21 @@
         <w:rPr>
           <w:lang w:val="ca-ES"/>
         </w:rPr>
-        <w:t>GET /api/privilegi/per-alumne/{nia}?idAvaluacio=1</w:t>
+        <w:t>GET /api/privilegi/per-alumne/{nia}?</w:t>
+      </w:r>
+      <w:proofErr w:type="spellStart"/>
+      <w:r>
+        <w:rPr>
+          <w:lang w:val="ca-ES"/>
+        </w:rPr>
+        <w:t>idAvaluacio</w:t>
+      </w:r>
+      <w:proofErr w:type="spellEnd"/>
+      <w:r>
+        <w:rPr>
+          <w:lang w:val="ca-ES"/>
+        </w:rPr>
+        <w:t>=1</w:t>
       </w:r>
     </w:p>
     <w:p>
@@ -22401,6 +22996,7 @@
         </w:rPr>
         <w:t xml:space="preserve">Gràcies als privilegis, </w:t>
       </w:r>
+      <w:proofErr w:type="spellStart"/>
       <w:r>
         <w:rPr>
           <w:b/>
@@ -22409,6 +23005,7 @@
         </w:rPr>
         <w:t>KarmaWEBAPI</w:t>
       </w:r>
+      <w:proofErr w:type="spellEnd"/>
       <w:r>
         <w:rPr>
           <w:lang w:val="ca-ES"/>
@@ -22492,6 +23089,7 @@
         </w:rPr>
         <w:t xml:space="preserve">El backend de </w:t>
       </w:r>
+      <w:proofErr w:type="spellStart"/>
       <w:r>
         <w:rPr>
           <w:b/>
@@ -22500,6 +23098,7 @@
         </w:rPr>
         <w:t>KarmaWEBAPI</w:t>
       </w:r>
+      <w:proofErr w:type="spellEnd"/>
       <w:r>
         <w:rPr>
           <w:lang w:val="ca-ES"/>
@@ -22606,6 +23205,7 @@
         </w:rPr>
         <w:t xml:space="preserve">En </w:t>
       </w:r>
+      <w:proofErr w:type="spellStart"/>
       <w:r>
         <w:rPr>
           <w:b/>
@@ -22614,6 +23214,7 @@
         </w:rPr>
         <w:t>KarmaWEBAPI</w:t>
       </w:r>
+      <w:proofErr w:type="spellEnd"/>
       <w:r>
         <w:rPr>
           <w:lang w:val="ca-ES"/>
@@ -23110,7 +23711,21 @@
         <w:rPr>
           <w:lang w:val="ca-ES"/>
         </w:rPr>
-        <w:t>POST /api/puntuacio/assignar-punts</w:t>
+        <w:t>POST /api/</w:t>
+      </w:r>
+      <w:proofErr w:type="spellStart"/>
+      <w:r>
+        <w:rPr>
+          <w:lang w:val="ca-ES"/>
+        </w:rPr>
+        <w:t>puntuacio</w:t>
+      </w:r>
+      <w:proofErr w:type="spellEnd"/>
+      <w:r>
+        <w:rPr>
+          <w:lang w:val="ca-ES"/>
+        </w:rPr>
+        <w:t>/assignar-punts</w:t>
       </w:r>
     </w:p>
     <w:p>
@@ -23366,6 +23981,7 @@
         <w:br/>
         <w:t xml:space="preserve">En </w:t>
       </w:r>
+      <w:proofErr w:type="spellStart"/>
       <w:r>
         <w:rPr>
           <w:b/>
@@ -23374,6 +23990,7 @@
         </w:rPr>
         <w:t>KarmaWEBAPI</w:t>
       </w:r>
+      <w:proofErr w:type="spellEnd"/>
       <w:r>
         <w:rPr>
           <w:lang w:val="ca-ES"/>
@@ -24082,6 +24699,7 @@
         </w:rPr>
         <w:t xml:space="preserve">i desenvolupament de clients que utilitzen </w:t>
       </w:r>
+      <w:proofErr w:type="spellStart"/>
       <w:r>
         <w:rPr>
           <w:b/>
@@ -24090,6 +24708,7 @@
         </w:rPr>
         <w:t>KarmaWEBAPI</w:t>
       </w:r>
+      <w:proofErr w:type="spellEnd"/>
       <w:r>
         <w:rPr>
           <w:lang w:val="ca-ES"/>
@@ -24132,8 +24751,18 @@
           <w:bCs/>
           <w:lang w:val="ca-ES"/>
         </w:rPr>
-        <w:t>exemples complets d’ús del sistema KarmaWEBAPI</w:t>
-      </w:r>
+        <w:t xml:space="preserve">exemples complets d’ús del sistema </w:t>
+      </w:r>
+      <w:proofErr w:type="spellStart"/>
+      <w:r>
+        <w:rPr>
+          <w:b/>
+          <w:bCs/>
+          <w:lang w:val="ca-ES"/>
+        </w:rPr>
+        <w:t>KarmaWEBAPI</w:t>
+      </w:r>
+      <w:proofErr w:type="spellEnd"/>
       <w:r>
         <w:rPr>
           <w:lang w:val="ca-ES"/>
@@ -24209,11 +24838,19 @@
           <w:lang w:val="ca-ES"/>
         </w:rPr>
       </w:pPr>
-      <w:r>
-        <w:rPr>
-          <w:lang w:val="ca-ES"/>
-        </w:rPr>
-        <w:t>veja quin ordre d’operacions cal seguir,</w:t>
+      <w:proofErr w:type="spellStart"/>
+      <w:r>
+        <w:rPr>
+          <w:lang w:val="ca-ES"/>
+        </w:rPr>
+        <w:t>veja</w:t>
+      </w:r>
+      <w:proofErr w:type="spellEnd"/>
+      <w:r>
+        <w:rPr>
+          <w:lang w:val="ca-ES"/>
+        </w:rPr>
+        <w:t xml:space="preserve"> quin ordre d’operacions cal seguir,</w:t>
       </w:r>
     </w:p>
     <w:p>
@@ -24230,7 +24867,21 @@
         <w:rPr>
           <w:lang w:val="ca-ES"/>
         </w:rPr>
-        <w:t>i relacione les accions amb els resultats obtinguts.</w:t>
+        <w:t xml:space="preserve">i </w:t>
+      </w:r>
+      <w:proofErr w:type="spellStart"/>
+      <w:r>
+        <w:rPr>
+          <w:lang w:val="ca-ES"/>
+        </w:rPr>
+        <w:t>relacione</w:t>
+      </w:r>
+      <w:proofErr w:type="spellEnd"/>
+      <w:r>
+        <w:rPr>
+          <w:lang w:val="ca-ES"/>
+        </w:rPr>
+        <w:t xml:space="preserve"> les accions amb els resultats obtinguts.</w:t>
       </w:r>
     </w:p>
     <w:p>
@@ -24797,7 +25448,21 @@
         <w:rPr>
           <w:lang w:val="ca-ES"/>
         </w:rPr>
-        <w:t>POST /api/puntuacio/assignar-punts</w:t>
+        <w:t>POST /api/</w:t>
+      </w:r>
+      <w:proofErr w:type="spellStart"/>
+      <w:r>
+        <w:rPr>
+          <w:lang w:val="ca-ES"/>
+        </w:rPr>
+        <w:t>puntuacio</w:t>
+      </w:r>
+      <w:proofErr w:type="spellEnd"/>
+      <w:r>
+        <w:rPr>
+          <w:lang w:val="ca-ES"/>
+        </w:rPr>
+        <w:t>/assignar-punts</w:t>
       </w:r>
     </w:p>
     <w:p>
@@ -25129,7 +25794,21 @@
         <w:rPr>
           <w:lang w:val="ca-ES"/>
         </w:rPr>
-        <w:t>POST /api/puntuacio/reiniciar-punts</w:t>
+        <w:t>POST /api/</w:t>
+      </w:r>
+      <w:proofErr w:type="spellStart"/>
+      <w:r>
+        <w:rPr>
+          <w:lang w:val="ca-ES"/>
+        </w:rPr>
+        <w:t>puntuacio</w:t>
+      </w:r>
+      <w:proofErr w:type="spellEnd"/>
+      <w:r>
+        <w:rPr>
+          <w:lang w:val="ca-ES"/>
+        </w:rPr>
+        <w:t>/reiniciar-punts</w:t>
       </w:r>
     </w:p>
     <w:p>
@@ -25308,7 +25987,35 @@
         <w:rPr>
           <w:lang w:val="ca-ES"/>
         </w:rPr>
-        <w:t>GET /api/puntuacio/per-alumne/{nia}?idAvaluacio=1</w:t>
+        <w:t>GET /api/</w:t>
+      </w:r>
+      <w:proofErr w:type="spellStart"/>
+      <w:r>
+        <w:rPr>
+          <w:lang w:val="ca-ES"/>
+        </w:rPr>
+        <w:t>puntuacio</w:t>
+      </w:r>
+      <w:proofErr w:type="spellEnd"/>
+      <w:r>
+        <w:rPr>
+          <w:lang w:val="ca-ES"/>
+        </w:rPr>
+        <w:t>/per-alumne/{nia}?</w:t>
+      </w:r>
+      <w:proofErr w:type="spellStart"/>
+      <w:r>
+        <w:rPr>
+          <w:lang w:val="ca-ES"/>
+        </w:rPr>
+        <w:t>idAvaluacio</w:t>
+      </w:r>
+      <w:proofErr w:type="spellEnd"/>
+      <w:r>
+        <w:rPr>
+          <w:lang w:val="ca-ES"/>
+        </w:rPr>
+        <w:t>=1</w:t>
       </w:r>
     </w:p>
     <w:p>
@@ -25362,11 +26069,19 @@
           <w:lang w:val="ca-ES"/>
         </w:rPr>
       </w:pPr>
-      <w:r>
-        <w:rPr>
-          <w:lang w:val="ca-ES"/>
-        </w:rPr>
-        <w:t>veja transparència en el sistema,</w:t>
+      <w:proofErr w:type="spellStart"/>
+      <w:r>
+        <w:rPr>
+          <w:lang w:val="ca-ES"/>
+        </w:rPr>
+        <w:t>veja</w:t>
+      </w:r>
+      <w:proofErr w:type="spellEnd"/>
+      <w:r>
+        <w:rPr>
+          <w:lang w:val="ca-ES"/>
+        </w:rPr>
+        <w:t xml:space="preserve"> transparència en el sistema,</w:t>
       </w:r>
     </w:p>
     <w:p>
@@ -25416,7 +26131,21 @@
           <w:lang w:val="ca-ES"/>
         </w:rPr>
         <w:br/>
-        <w:t>Un alumne arriba al llindar de karma necessari per obtindre un privilegi.</w:t>
+        <w:t xml:space="preserve">Un alumne arriba al llindar de karma necessari per </w:t>
+      </w:r>
+      <w:proofErr w:type="spellStart"/>
+      <w:r>
+        <w:rPr>
+          <w:lang w:val="ca-ES"/>
+        </w:rPr>
+        <w:t>obtindre</w:t>
+      </w:r>
+      <w:proofErr w:type="spellEnd"/>
+      <w:r>
+        <w:rPr>
+          <w:lang w:val="ca-ES"/>
+        </w:rPr>
+        <w:t xml:space="preserve"> un privilegi.</w:t>
       </w:r>
     </w:p>
     <w:p>
@@ -25544,13 +26273,23 @@
         </w:rPr>
         <w:t xml:space="preserve">Aquests casos d’ús mostren que </w:t>
       </w:r>
+      <w:proofErr w:type="spellStart"/>
       <w:r>
         <w:rPr>
           <w:b/>
           <w:bCs/>
           <w:lang w:val="ca-ES"/>
         </w:rPr>
-        <w:t>KarmaWEBAPI funciona com un sistema complet</w:t>
+        <w:t>KarmaWEBAPI</w:t>
+      </w:r>
+      <w:proofErr w:type="spellEnd"/>
+      <w:r>
+        <w:rPr>
+          <w:b/>
+          <w:bCs/>
+          <w:lang w:val="ca-ES"/>
+        </w:rPr>
+        <w:t xml:space="preserve"> funciona com un sistema complet</w:t>
       </w:r>
       <w:r>
         <w:rPr>
@@ -25641,7 +26380,21 @@
         <w:rPr>
           <w:lang w:val="ca-ES"/>
         </w:rPr>
-        <w:t>entendre APIs REST reals,</w:t>
+        <w:t xml:space="preserve">entendre </w:t>
+      </w:r>
+      <w:proofErr w:type="spellStart"/>
+      <w:r>
+        <w:rPr>
+          <w:lang w:val="ca-ES"/>
+        </w:rPr>
+        <w:t>APIs</w:t>
+      </w:r>
+      <w:proofErr w:type="spellEnd"/>
+      <w:r>
+        <w:rPr>
+          <w:lang w:val="ca-ES"/>
+        </w:rPr>
+        <w:t xml:space="preserve"> REST reals,</w:t>
       </w:r>
     </w:p>
     <w:p>
@@ -25702,6 +26455,7 @@
         </w:rPr>
         <w:t xml:space="preserve">Una vegada conegut el funcionament general de </w:t>
       </w:r>
+      <w:proofErr w:type="spellStart"/>
       <w:r>
         <w:rPr>
           <w:b/>
@@ -25710,6 +26464,7 @@
         </w:rPr>
         <w:t>KarmaWEBAPI</w:t>
       </w:r>
+      <w:proofErr w:type="spellEnd"/>
       <w:r>
         <w:rPr>
           <w:lang w:val="ca-ES"/>
@@ -25766,6 +26521,7 @@
         </w:rPr>
         <w:t xml:space="preserve">Cada acció que es realitza en </w:t>
       </w:r>
+      <w:proofErr w:type="spellStart"/>
       <w:r>
         <w:rPr>
           <w:b/>
@@ -25774,11 +26530,26 @@
         </w:rPr>
         <w:t>KarmaWEBAPI</w:t>
       </w:r>
-      <w:r>
-        <w:rPr>
-          <w:lang w:val="ca-ES"/>
-        </w:rPr>
-        <w:t xml:space="preserve"> depén del </w:t>
+      <w:proofErr w:type="spellEnd"/>
+      <w:r>
+        <w:rPr>
+          <w:lang w:val="ca-ES"/>
+        </w:rPr>
+        <w:t xml:space="preserve"> </w:t>
+      </w:r>
+      <w:proofErr w:type="spellStart"/>
+      <w:r>
+        <w:rPr>
+          <w:lang w:val="ca-ES"/>
+        </w:rPr>
+        <w:t>depén</w:t>
+      </w:r>
+      <w:proofErr w:type="spellEnd"/>
+      <w:r>
+        <w:rPr>
+          <w:lang w:val="ca-ES"/>
+        </w:rPr>
+        <w:t xml:space="preserve"> del </w:t>
       </w:r>
       <w:r>
         <w:rPr>
@@ -26634,7 +27405,21 @@
         <w:rPr>
           <w:lang w:val="ca-ES"/>
         </w:rPr>
-        <w:t>En KarmaWEBAPI això implica:</w:t>
+        <w:t xml:space="preserve">En </w:t>
+      </w:r>
+      <w:proofErr w:type="spellStart"/>
+      <w:r>
+        <w:rPr>
+          <w:lang w:val="ca-ES"/>
+        </w:rPr>
+        <w:t>KarmaWEBAPI</w:t>
+      </w:r>
+      <w:proofErr w:type="spellEnd"/>
+      <w:r>
+        <w:rPr>
+          <w:lang w:val="ca-ES"/>
+        </w:rPr>
+        <w:t xml:space="preserve"> això implica:</w:t>
       </w:r>
     </w:p>
     <w:p>
@@ -26801,27 +27586,55 @@
         </w:rPr>
         <w:t xml:space="preserve">Al llarg d’aquesta guia s’ha presentat </w:t>
       </w:r>
+      <w:proofErr w:type="spellStart"/>
       <w:r>
         <w:rPr>
           <w:b/>
           <w:bCs/>
           <w:lang w:val="ca-ES"/>
         </w:rPr>
-        <w:t>KarmaWEBAPI com un sistema complet</w:t>
-      </w:r>
-      <w:r>
-        <w:rPr>
-          <w:lang w:val="ca-ES"/>
-        </w:rPr>
-        <w:t xml:space="preserve">, pensat no sols per a funcionar, sinó també per a </w:t>
-      </w:r>
+        <w:t>KarmaWEBAPI</w:t>
+      </w:r>
+      <w:proofErr w:type="spellEnd"/>
       <w:r>
         <w:rPr>
           <w:b/>
           <w:bCs/>
           <w:lang w:val="ca-ES"/>
         </w:rPr>
-        <w:t>aprendre a treballar amb APIs REST reals i dominis complexos</w:t>
+        <w:t xml:space="preserve"> com un sistema complet</w:t>
+      </w:r>
+      <w:r>
+        <w:rPr>
+          <w:lang w:val="ca-ES"/>
+        </w:rPr>
+        <w:t xml:space="preserve">, pensat no sols per a funcionar, sinó també per a </w:t>
+      </w:r>
+      <w:r>
+        <w:rPr>
+          <w:b/>
+          <w:bCs/>
+          <w:lang w:val="ca-ES"/>
+        </w:rPr>
+        <w:t xml:space="preserve">aprendre a treballar amb </w:t>
+      </w:r>
+      <w:proofErr w:type="spellStart"/>
+      <w:r>
+        <w:rPr>
+          <w:b/>
+          <w:bCs/>
+          <w:lang w:val="ca-ES"/>
+        </w:rPr>
+        <w:t>APIs</w:t>
+      </w:r>
+      <w:proofErr w:type="spellEnd"/>
+      <w:r>
+        <w:rPr>
+          <w:b/>
+          <w:bCs/>
+          <w:lang w:val="ca-ES"/>
+        </w:rPr>
+        <w:t xml:space="preserve"> REST reals i dominis complexos</w:t>
       </w:r>
       <w:r>
         <w:rPr>
@@ -26927,13 +27740,41 @@
         </w:rPr>
         <w:t xml:space="preserve">Un dels aspectes més importants és entendre que </w:t>
       </w:r>
+      <w:proofErr w:type="spellStart"/>
       <w:r>
         <w:rPr>
           <w:b/>
           <w:bCs/>
           <w:lang w:val="ca-ES"/>
         </w:rPr>
-        <w:t>KarmaWEBAPI no és un conjunt d’endpoints inconnexos</w:t>
+        <w:t>KarmaWEBAPI</w:t>
+      </w:r>
+      <w:proofErr w:type="spellEnd"/>
+      <w:r>
+        <w:rPr>
+          <w:b/>
+          <w:bCs/>
+          <w:lang w:val="ca-ES"/>
+        </w:rPr>
+        <w:t xml:space="preserve"> no és un conjunt </w:t>
+      </w:r>
+      <w:proofErr w:type="spellStart"/>
+      <w:r>
+        <w:rPr>
+          <w:b/>
+          <w:bCs/>
+          <w:lang w:val="ca-ES"/>
+        </w:rPr>
+        <w:t>d’endpoints</w:t>
+      </w:r>
+      <w:proofErr w:type="spellEnd"/>
+      <w:r>
+        <w:rPr>
+          <w:b/>
+          <w:bCs/>
+          <w:lang w:val="ca-ES"/>
+        </w:rPr>
+        <w:t xml:space="preserve"> inconnexos</w:t>
       </w:r>
       <w:r>
         <w:rPr>
@@ -27025,7 +27866,21 @@
           <w:lang w:val="ca-ES"/>
         </w:rPr>
         <w:lastRenderedPageBreak/>
-        <w:t>practicar el consum d’APIs REST,</w:t>
+        <w:t xml:space="preserve">practicar el consum </w:t>
+      </w:r>
+      <w:proofErr w:type="spellStart"/>
+      <w:r>
+        <w:rPr>
+          <w:lang w:val="ca-ES"/>
+        </w:rPr>
+        <w:t>d’APIs</w:t>
+      </w:r>
+      <w:proofErr w:type="spellEnd"/>
+      <w:r>
+        <w:rPr>
+          <w:lang w:val="ca-ES"/>
+        </w:rPr>
+        <w:t xml:space="preserve"> REST,</w:t>
       </w:r>
     </w:p>
     <w:p>
@@ -27149,8 +28004,18 @@
           <w:bCs/>
           <w:lang w:val="ca-ES"/>
         </w:rPr>
-        <w:t>base sòlida per a començar a treballar amb KarmaWEBAPI</w:t>
-      </w:r>
+        <w:t xml:space="preserve">base sòlida per a començar a treballar amb </w:t>
+      </w:r>
+      <w:proofErr w:type="spellStart"/>
+      <w:r>
+        <w:rPr>
+          <w:b/>
+          <w:bCs/>
+          <w:lang w:val="ca-ES"/>
+        </w:rPr>
+        <w:t>KarmaWEBAPI</w:t>
+      </w:r>
+      <w:proofErr w:type="spellEnd"/>
       <w:r>
         <w:rPr>
           <w:lang w:val="ca-ES"/>
@@ -27166,7 +28031,7 @@
       </w:pPr>
     </w:p>
     <w:sectPr>
-      <w:footerReference w:type="default" r:id="rId9"/>
+      <w:footerReference w:type="default" r:id="rId13"/>
       <w:pgSz w:w="12240" w:h="15840"/>
       <w:pgMar w:top="1440" w:right="1800" w:bottom="1440" w:left="1800" w:header="720" w:footer="720" w:gutter="0"/>
       <w:pgNumType w:start="0"/>
@@ -60969,7 +61834,7 @@
 <file path=customXml/item1.xml><?xml version="1.0" encoding="utf-8"?>
 <CoverPageProperties xmlns="http://schemas.microsoft.com/office/2006/coverPageProps">
   <PublishDate>2026</PublishDate>
-  <Abstract/>
+  <Abstract>Manual funcional per al consum de l’API REST KarmaWEBAPI</Abstract>
   <CompanyAddress/>
   <CompanyPhone/>
   <CompanyFax/>

</xml_diff>